<commit_message>
HĐ Phục Hưng: chuyển sang hình thức hợp đồng kinh tế, bỏ các dẫn chiếu thầu chính/thầu phụ
Co-Authored-By: Claude Opus 5.5 <noreply@anthropic.com>
Claude-Session: https://claude.ai/code/session_01HaB2daYpxGuc1PNCjeRWP1
</commit_message>
<xml_diff>
--- a/3. DỰ THẢO HĐ/HĐ Phục Hưng - Phần ngầm (track change 06.10.2026).docx
+++ b/3. DỰ THẢO HĐ/HĐ Phục Hưng - Phần ngầm (track change 06.10.2026).docx
@@ -252,16 +252,30 @@
           <w:lang w:val="pt-BR"/>
         </w:rPr>
       </w:pPr>
-      <w:r>
-        <w:rPr>
-          <w:rFonts w:ascii="Times New Roman" w:hAnsi="Times New Roman"/>
-          <w:b/>
-          <w:sz w:val="30"/>
-          <w:szCs w:val="30"/>
-          <w:lang w:val="pt-BR"/>
-        </w:rPr>
-        <w:t>HỢP ĐỒNG THI CÔNG XÂY DỰNG CÔNG TRÌNH</w:t>
-      </w:r>
+      <w:del w:id="9009" w:author="VNCN E&amp;C" w:date="2026-10-06T08:00:00Z">
+        <w:r>
+          <w:rPr>
+            <w:rFonts w:ascii="Times New Roman" w:hAnsi="Times New Roman"/>
+            <w:b/>
+            <w:sz w:val="30"/>
+            <w:szCs w:val="30"/>
+            <w:lang w:val="pt-BR"/>
+          </w:rPr>
+          <w:delText>HỢP ĐỒNG THI CÔNG XÂY DỰNG CÔNG TRÌNH</w:delText>
+        </w:r>
+      </w:del>
+      <w:ins w:id="9010" w:author="VNCN E&amp;C" w:date="2026-10-06T08:00:00Z">
+        <w:r>
+          <w:rPr>
+            <w:rFonts w:ascii="Times New Roman" w:hAnsi="Times New Roman"/>
+            <w:b/>
+            <w:sz w:val="30"/>
+            <w:szCs w:val="30"/>
+            <w:lang w:val="pt-BR"/>
+          </w:rPr>
+          <w:t xml:space="preserve">HỢP ĐỒNG KINH TẾ</w:t>
+        </w:r>
+      </w:ins>
     </w:p>
     <w:p>
       <w:pPr>
@@ -349,7 +363,7 @@
             <w:szCs w:val="26"/>
             <w:lang w:val="pt-BR"/>
           </w:rPr>
-          <w:t xml:space="preserve">/2026/HĐXD/VNCNEC-PH</w:t>
+          <w:t xml:space="preserve">/2026/HĐKT/VNCNEC-PH</w:t>
         </w:r>
       </w:ins>
     </w:p>
@@ -994,14 +1008,26 @@
           <w:szCs w:val="30"/>
         </w:rPr>
       </w:pPr>
-      <w:r>
-        <w:rPr>
-          <w:rFonts w:ascii="Times New Roman" w:hAnsi="Times New Roman"/>
-          <w:sz w:val="30"/>
-          <w:szCs w:val="30"/>
-        </w:rPr>
-        <w:t>HỢP ĐỒNG THI CÔNG XÂY DỰNG</w:t>
-      </w:r>
+      <w:del w:id="9011" w:author="VNCN E&amp;C" w:date="2026-10-06T08:00:00Z">
+        <w:r>
+          <w:rPr>
+            <w:rFonts w:ascii="Times New Roman" w:hAnsi="Times New Roman"/>
+            <w:sz w:val="30"/>
+            <w:szCs w:val="30"/>
+          </w:rPr>
+          <w:delText>HỢP ĐỒNG THI CÔNG XÂY DỰNG</w:delText>
+        </w:r>
+      </w:del>
+      <w:ins w:id="9012" w:author="VNCN E&amp;C" w:date="2026-10-06T08:00:00Z">
+        <w:r>
+          <w:rPr>
+            <w:rFonts w:ascii="Times New Roman" w:hAnsi="Times New Roman"/>
+            <w:sz w:val="30"/>
+            <w:szCs w:val="30"/>
+          </w:rPr>
+          <w:t xml:space="preserve">HỢP ĐỒNG KINH TẾ</w:t>
+        </w:r>
+      </w:ins>
     </w:p>
     <w:p>
       <w:pPr>
@@ -1026,7 +1052,7 @@
         </w:rPr>
         <w:t xml:space="preserve">Số:</w:t>
       </w:r>
-      <w:del w:id="9009" w:author="VNCN E&amp;C" w:date="2026-10-06T08:00:00Z">
+      <w:del w:id="9013" w:author="VNCN E&amp;C" w:date="2026-10-06T08:00:00Z">
         <w:r>
           <w:rPr>
             <w:rFonts w:ascii="Times New Roman" w:hAnsi="Times New Roman"/>
@@ -1049,7 +1075,7 @@
           <w:delText>-</w:delText>
         </w:r>
       </w:del>
-      <w:ins w:id="9010" w:author="VNCN E&amp;C" w:date="2026-10-06T08:00:00Z">
+      <w:ins w:id="9014" w:author="VNCN E&amp;C" w:date="2026-10-06T08:00:00Z">
         <w:r>
           <w:rPr>
             <w:rFonts w:ascii="Times New Roman" w:hAnsi="Times New Roman"/>
@@ -1076,7 +1102,7 @@
             <w:sz w:val="26"/>
             <w:szCs w:val="26"/>
           </w:rPr>
-          <w:t xml:space="preserve">/2026/HĐXD/VNCNEC-PH</w:t>
+          <w:t xml:space="preserve">/2026/HĐKT/VNCNEC-PH</w:t>
         </w:r>
       </w:ins>
     </w:p>
@@ -1142,7 +1168,7 @@
         </w:rPr>
         <w:t xml:space="preserve"> </w:t>
       </w:r>
-      <w:del w:id="9011" w:author="VNCN E&amp;C" w:date="2026-10-06T08:00:00Z">
+      <w:del w:id="9015" w:author="VNCN E&amp;C" w:date="2026-10-06T08:00:00Z">
         <w:r>
           <w:rPr>
             <w:rFonts w:ascii="Times New Roman" w:hAnsi="Times New Roman"/>
@@ -1173,7 +1199,7 @@
           <w:delText xml:space="preserve">, xây, trát, ốp, lát, sơn, bả,..)</w:delText>
         </w:r>
       </w:del>
-      <w:ins w:id="9012" w:author="VNCN E&amp;C" w:date="2026-10-06T08:00:00Z">
+      <w:ins w:id="9016" w:author="VNCN E&amp;C" w:date="2026-10-06T08:00:00Z">
         <w:r>
           <w:rPr>
             <w:rFonts w:ascii="Times New Roman" w:hAnsi="Times New Roman"/>
@@ -1337,7 +1363,7 @@
           <w:lang w:val="nl-NL"/>
         </w:rPr>
       </w:pPr>
-      <w:ins w:id="9013" w:author="VNCN E&amp;C" w:date="2026-10-06T08:00:00Z">
+      <w:ins w:id="9017" w:author="VNCN E&amp;C" w:date="2026-10-06T08:00:00Z">
         <w:r>
           <w:rPr>
             <w:rFonts w:ascii="Times New Roman" w:hAnsi="Times New Roman"/>
@@ -1414,6 +1440,7 @@
         <w:contextualSpacing/>
         <w:jc w:val="both"/>
         <w:rPr>
+          <w:del w:id="9021" w:author="VNCN E&amp;C" w:date="2026-10-06T08:00:00Z"/>
           <w:rFonts w:ascii="Times New Roman" w:hAnsi="Times New Roman"/>
           <w:i/>
           <w:sz w:val="26"/>
@@ -1421,121 +1448,7 @@
           <w:lang w:val="nl-NL"/>
         </w:rPr>
       </w:pPr>
-      <w:r>
-        <w:rPr>
-          <w:rFonts w:ascii="Times New Roman" w:hAnsi="Times New Roman"/>
-          <w:i/>
-          <w:sz w:val="26"/>
-          <w:szCs w:val="26"/>
-          <w:lang w:val="nl-NL"/>
-        </w:rPr>
-        <w:t xml:space="preserve">- C</w:t>
-      </w:r>
-      <w:r>
-        <w:rPr>
-          <w:rFonts w:ascii="Times New Roman" w:hAnsi="Times New Roman" w:hint="eastAsia"/>
-          <w:i/>
-          <w:sz w:val="26"/>
-          <w:szCs w:val="26"/>
-          <w:lang w:val="nl-NL"/>
-        </w:rPr>
-        <w:t>ă</w:t>
-      </w:r>
-      <w:r>
-        <w:rPr>
-          <w:rFonts w:ascii="Times New Roman" w:hAnsi="Times New Roman"/>
-          <w:i/>
-          <w:sz w:val="26"/>
-          <w:szCs w:val="26"/>
-          <w:lang w:val="nl-NL"/>
-        </w:rPr>
-        <w:t>n cứ Thông báo giao thầu số 0608/CV/2025/IFT-TP ngày 06/08/2025 V/v thực hiện gói thầu “Tổng thầu thiết kế và thi công” Dự án Xây dựng nhà ở cho lực l</w:t>
-      </w:r>
-      <w:r>
-        <w:rPr>
-          <w:rFonts w:ascii="Times New Roman" w:hAnsi="Times New Roman" w:hint="eastAsia"/>
-          <w:i/>
-          <w:sz w:val="26"/>
-          <w:szCs w:val="26"/>
-          <w:lang w:val="nl-NL"/>
-        </w:rPr>
-        <w:t>ư</w:t>
-      </w:r>
-      <w:r>
-        <w:rPr>
-          <w:rFonts w:ascii="Times New Roman" w:hAnsi="Times New Roman"/>
-          <w:i/>
-          <w:sz w:val="26"/>
-          <w:szCs w:val="26"/>
-          <w:lang w:val="nl-NL"/>
-        </w:rPr>
-        <w:t xml:space="preserve">ợng vũ trang Công an nhân dân tại ô </w:t>
-      </w:r>
-      <w:r>
-        <w:rPr>
-          <w:rFonts w:ascii="Times New Roman" w:hAnsi="Times New Roman" w:hint="eastAsia"/>
-          <w:i/>
-          <w:sz w:val="26"/>
-          <w:szCs w:val="26"/>
-          <w:lang w:val="nl-NL"/>
-        </w:rPr>
-        <w:t>đ</w:t>
-      </w:r>
-      <w:r>
-        <w:rPr>
-          <w:rFonts w:ascii="Times New Roman" w:hAnsi="Times New Roman"/>
-          <w:i/>
-          <w:sz w:val="26"/>
-          <w:szCs w:val="26"/>
-          <w:lang w:val="nl-NL"/>
-        </w:rPr>
-        <w:t xml:space="preserve">ất C3-ODK3 và C3-ODK4 thuộc phân khu </w:t>
-      </w:r>
-      <w:r>
-        <w:rPr>
-          <w:rFonts w:ascii="Times New Roman" w:hAnsi="Times New Roman" w:hint="eastAsia"/>
-          <w:i/>
-          <w:sz w:val="26"/>
-          <w:szCs w:val="26"/>
-          <w:lang w:val="nl-NL"/>
-        </w:rPr>
-        <w:t>đô</w:t>
-      </w:r>
-      <w:r>
-        <w:rPr>
-          <w:rFonts w:ascii="Times New Roman" w:hAnsi="Times New Roman"/>
-          <w:i/>
-          <w:sz w:val="26"/>
-          <w:szCs w:val="26"/>
-          <w:lang w:val="nl-NL"/>
-        </w:rPr>
-        <w:t xml:space="preserve"> thị H2- 4, P. Yên Sở, TP. Hà Nội.</w:t>
-      </w:r>
-    </w:p>
-    <w:p>
-      <w:pPr>
-        <w:spacing w:after="120" w:line="276" w:lineRule="auto"/>
-        <w:contextualSpacing/>
-        <w:jc w:val="both"/>
-        <w:rPr>
-          <w:rFonts w:ascii="Times New Roman" w:hAnsi="Times New Roman"/>
-          <w:i/>
-          <w:sz w:val="26"/>
-          <w:szCs w:val="26"/>
-          <w:lang w:val="nl-NL"/>
-        </w:rPr>
-      </w:pPr>
-      <w:r>
-        <w:rPr>
-          <w:rFonts w:ascii="Times New Roman" w:hAnsi="Times New Roman"/>
-          <w:i/>
-          <w:sz w:val="26"/>
-          <w:szCs w:val="26"/>
-          <w:lang w:val="nl-NL"/>
-        </w:rPr>
-        <w:t xml:space="preserve">- Căn cứ </w:t>
-      </w:r>
-      <w:del w:id="9014" w:author="VNCN E&amp;C" w:date="2026-10-06T08:00:00Z">
+      <w:del w:id="9020" w:author="VNCN E&amp;C" w:date="2026-10-06T08:00:00Z">
         <w:r>
           <w:rPr>
             <w:rFonts w:ascii="Times New Roman" w:hAnsi="Times New Roman"/>
@@ -1544,7 +1457,114 @@
             <w:szCs w:val="26"/>
             <w:lang w:val="nl-NL"/>
           </w:rPr>
-          <w:delText xml:space="preserve">Hợp đồng thầu chính số </w:delText>
+          <w:delText xml:space="preserve">- C</w:delText>
+        </w:r>
+        <w:r>
+          <w:rPr>
+            <w:rFonts w:ascii="Times New Roman" w:hAnsi="Times New Roman" w:hint="eastAsia"/>
+            <w:i/>
+            <w:sz w:val="26"/>
+            <w:szCs w:val="26"/>
+            <w:lang w:val="nl-NL"/>
+          </w:rPr>
+          <w:delText>ă</w:delText>
+        </w:r>
+        <w:r>
+          <w:rPr>
+            <w:rFonts w:ascii="Times New Roman" w:hAnsi="Times New Roman"/>
+            <w:i/>
+            <w:sz w:val="26"/>
+            <w:szCs w:val="26"/>
+            <w:lang w:val="nl-NL"/>
+          </w:rPr>
+          <w:delText>n cứ Thông báo giao thầu số 0608/CV/2025/IFT-TP ngày 06/08/2025 V/v thực hiện gói thầu “Tổng thầu thiết kế và thi công” Dự án Xây dựng nhà ở cho lực l</w:delText>
+        </w:r>
+        <w:r>
+          <w:rPr>
+            <w:rFonts w:ascii="Times New Roman" w:hAnsi="Times New Roman" w:hint="eastAsia"/>
+            <w:i/>
+            <w:sz w:val="26"/>
+            <w:szCs w:val="26"/>
+            <w:lang w:val="nl-NL"/>
+          </w:rPr>
+          <w:delText>ư</w:delText>
+        </w:r>
+        <w:r>
+          <w:rPr>
+            <w:rFonts w:ascii="Times New Roman" w:hAnsi="Times New Roman"/>
+            <w:i/>
+            <w:sz w:val="26"/>
+            <w:szCs w:val="26"/>
+            <w:lang w:val="nl-NL"/>
+          </w:rPr>
+          <w:delText xml:space="preserve">ợng vũ trang Công an nhân dân tại ô </w:delText>
+        </w:r>
+        <w:r>
+          <w:rPr>
+            <w:rFonts w:ascii="Times New Roman" w:hAnsi="Times New Roman" w:hint="eastAsia"/>
+            <w:i/>
+            <w:sz w:val="26"/>
+            <w:szCs w:val="26"/>
+            <w:lang w:val="nl-NL"/>
+          </w:rPr>
+          <w:delText>đ</w:delText>
+        </w:r>
+        <w:r>
+          <w:rPr>
+            <w:rFonts w:ascii="Times New Roman" w:hAnsi="Times New Roman"/>
+            <w:i/>
+            <w:sz w:val="26"/>
+            <w:szCs w:val="26"/>
+            <w:lang w:val="nl-NL"/>
+          </w:rPr>
+          <w:delText xml:space="preserve">ất C3-ODK3 và C3-ODK4 thuộc phân khu </w:delText>
+        </w:r>
+        <w:r>
+          <w:rPr>
+            <w:rFonts w:ascii="Times New Roman" w:hAnsi="Times New Roman" w:hint="eastAsia"/>
+            <w:i/>
+            <w:sz w:val="26"/>
+            <w:szCs w:val="26"/>
+            <w:lang w:val="nl-NL"/>
+          </w:rPr>
+          <w:delText>đô</w:delText>
+        </w:r>
+        <w:r>
+          <w:rPr>
+            <w:rFonts w:ascii="Times New Roman" w:hAnsi="Times New Roman"/>
+            <w:i/>
+            <w:sz w:val="26"/>
+            <w:szCs w:val="26"/>
+            <w:lang w:val="nl-NL"/>
+          </w:rPr>
+          <w:delText xml:space="preserve"> thị H2- 4, P. Yên Sở, TP. Hà Nội.</w:delText>
+        </w:r>
+      </w:del>
+    </w:p>
+    <w:p>
+      <w:pPr>
+        <w:spacing w:after="120" w:line="276" w:lineRule="auto"/>
+        <w:contextualSpacing/>
+        <w:jc w:val="both"/>
+        <w:rPr>
+          <w:del w:id="9019" w:author="VNCN E&amp;C" w:date="2026-10-06T08:00:00Z"/>
+          <w:rFonts w:ascii="Times New Roman" w:hAnsi="Times New Roman"/>
+          <w:i/>
+          <w:sz w:val="26"/>
+          <w:szCs w:val="26"/>
+          <w:lang w:val="nl-NL"/>
+        </w:rPr>
+      </w:pPr>
+      <w:del w:id="9018" w:author="VNCN E&amp;C" w:date="2026-10-06T08:00:00Z">
+        <w:r>
+          <w:rPr>
+            <w:rFonts w:ascii="Times New Roman" w:hAnsi="Times New Roman"/>
+            <w:i/>
+            <w:sz w:val="26"/>
+            <w:szCs w:val="26"/>
+            <w:lang w:val="nl-NL"/>
+          </w:rPr>
+          <w:delText xml:space="preserve">- Căn cứ Hợp đồng thầu chính số </w:delText>
         </w:r>
         <w:r>
           <w:rPr>
@@ -1586,31 +1606,9 @@
             <w:szCs w:val="26"/>
             <w:lang w:val="nl-NL"/>
           </w:rPr>
-          <w:delText xml:space="preserve"> giữa Chủ đầu tư và Bên A</w:delText>
+          <w:delText xml:space="preserve"> giữa Chủ đầu tư và Bên A;</w:delText>
         </w:r>
       </w:del>
-      <w:ins w:id="9015" w:author="VNCN E&amp;C" w:date="2026-10-06T08:00:00Z">
-        <w:r>
-          <w:rPr>
-            <w:rFonts w:ascii="Times New Roman" w:hAnsi="Times New Roman"/>
-            <w:i/>
-            <w:sz w:val="26"/>
-            <w:szCs w:val="26"/>
-            <w:lang w:val="nl-NL"/>
-          </w:rPr>
-          <w:t xml:space="preserve">Hợp đồng Tổng thầu thi công xây dựng số 01/2026/HĐTTXL/LDIFT-TP &amp; LD VNCNEC-VH ngày 16/7/2026 giữa Chủ đầu tư và Liên danh Công ty CP Đầu tư Xây dựng và Kỹ thuật VNCN E&amp;C – Công ty CP Xây dựng Hạ tầng và Thương mại Việt Hưng, các phụ lục kèm theo</w:t>
-        </w:r>
-      </w:ins>
-      <w:r>
-        <w:rPr>
-          <w:rFonts w:ascii="Times New Roman" w:hAnsi="Times New Roman"/>
-          <w:i/>
-          <w:sz w:val="26"/>
-          <w:szCs w:val="26"/>
-          <w:lang w:val="nl-NL"/>
-        </w:rPr>
-        <w:t xml:space="preserve">;</w:t>
-      </w:r>
     </w:p>
     <w:p>
       <w:pPr>
@@ -1675,7 +1673,7 @@
         </w:rPr>
         <w:t xml:space="preserve"> thiết kế, </w:t>
       </w:r>
-      <w:del w:id="9016" w:author="VNCN E&amp;C" w:date="2026-10-06T08:00:00Z">
+      <w:del w:id="9022" w:author="VNCN E&amp;C" w:date="2026-10-06T08:00:00Z">
         <w:r>
           <w:rPr>
             <w:rFonts w:ascii="Times New Roman" w:hAnsi="Times New Roman"/>
@@ -1787,7 +1785,7 @@
           <w:delText xml:space="preserve">ề xuất) và kết quả lựa chọn nhà thầu (nếu có)</w:delText>
         </w:r>
       </w:del>
-      <w:ins w:id="9017" w:author="VNCN E&amp;C" w:date="2026-10-06T08:00:00Z">
+      <w:ins w:id="9023" w:author="VNCN E&amp;C" w:date="2026-10-06T08:00:00Z">
         <w:r>
           <w:rPr>
             <w:rFonts w:ascii="Times New Roman" w:hAnsi="Times New Roman"/>
@@ -2041,7 +2039,7 @@
         </w:rPr>
         <w:t xml:space="preserve">Hôm nay, </w:t>
       </w:r>
-      <w:del w:id="9018" w:author="VNCN E&amp;C" w:date="2026-10-06T08:00:00Z">
+      <w:del w:id="9024" w:author="VNCN E&amp;C" w:date="2026-10-06T08:00:00Z">
         <w:r>
           <w:rPr>
             <w:rFonts w:ascii="Times New Roman" w:hAnsi="Times New Roman"/>
@@ -2062,7 +2060,7 @@
           <w:delText xml:space="preserve">       năm 2026</w:delText>
         </w:r>
       </w:del>
-      <w:ins w:id="9019" w:author="VNCN E&amp;C" w:date="2026-10-06T08:00:00Z">
+      <w:ins w:id="9025" w:author="VNCN E&amp;C" w:date="2026-10-06T08:00:00Z">
         <w:r>
           <w:rPr>
             <w:rFonts w:ascii="Times New Roman" w:hAnsi="Times New Roman"/>
@@ -2873,7 +2871,7 @@
                 <w:lang w:val="vi-VN"/>
               </w:rPr>
             </w:pPr>
-            <w:ins w:id="9020" w:author="VNCN E&amp;C" w:date="2026-10-06T08:00:00Z">
+            <w:ins w:id="9026" w:author="VNCN E&amp;C" w:date="2026-10-06T08:00:00Z">
               <w:r>
                 <w:rPr>
                   <w:rFonts w:ascii="Times New Roman" w:hAnsi="Times New Roman"/>
@@ -2892,13 +2890,13 @@
               <w:spacing w:after="120" w:line="276" w:lineRule="auto"/>
               <w:jc w:val="both"/>
               <w:rPr>
-                <w:ins w:id="9021" w:author="VNCN E&amp;C" w:date="2026-10-06T08:00:00Z"/>
+                <w:ins w:id="9027" w:author="VNCN E&amp;C" w:date="2026-10-06T08:00:00Z"/>
                 <w:rFonts w:ascii="Times New Roman" w:hAnsi="Times New Roman"/>
                 <w:sz w:val="26"/>
                 <w:szCs w:val="26"/>
               </w:rPr>
             </w:pPr>
-            <w:ins w:id="9022" w:author="VNCN E&amp;C" w:date="2026-10-06T08:00:00Z">
+            <w:ins w:id="9028" w:author="VNCN E&amp;C" w:date="2026-10-06T08:00:00Z">
               <w:r>
                 <w:rPr>
                   <w:rFonts w:ascii="Times New Roman" w:hAnsi="Times New Roman"/>
@@ -2916,13 +2914,13 @@
               <w:spacing w:after="120" w:line="276" w:lineRule="auto"/>
               <w:jc w:val="both"/>
               <w:rPr>
-                <w:ins w:id="9023" w:author="VNCN E&amp;C" w:date="2026-10-06T08:00:00Z"/>
+                <w:ins w:id="9029" w:author="VNCN E&amp;C" w:date="2026-10-06T08:00:00Z"/>
                 <w:rFonts w:ascii="Times New Roman" w:hAnsi="Times New Roman"/>
                 <w:sz w:val="26"/>
                 <w:szCs w:val="26"/>
               </w:rPr>
             </w:pPr>
-            <w:ins w:id="9024" w:author="VNCN E&amp;C" w:date="2026-10-06T08:00:00Z">
+            <w:ins w:id="9030" w:author="VNCN E&amp;C" w:date="2026-10-06T08:00:00Z">
               <w:r>
                 <w:rPr>
                   <w:rFonts w:ascii="Times New Roman" w:hAnsi="Times New Roman"/>
@@ -2959,13 +2957,13 @@
               <w:spacing w:after="120" w:line="276" w:lineRule="auto"/>
               <w:jc w:val="both"/>
               <w:rPr>
-                <w:ins w:id="9025" w:author="VNCN E&amp;C" w:date="2026-10-06T08:00:00Z"/>
+                <w:ins w:id="9031" w:author="VNCN E&amp;C" w:date="2026-10-06T08:00:00Z"/>
                 <w:rFonts w:ascii="Times New Roman" w:hAnsi="Times New Roman"/>
                 <w:sz w:val="26"/>
                 <w:szCs w:val="26"/>
               </w:rPr>
             </w:pPr>
-            <w:ins w:id="9026" w:author="VNCN E&amp;C" w:date="2026-10-06T08:00:00Z">
+            <w:ins w:id="9032" w:author="VNCN E&amp;C" w:date="2026-10-06T08:00:00Z">
               <w:r>
                 <w:rPr>
                   <w:rFonts w:ascii="Times New Roman" w:hAnsi="Times New Roman"/>
@@ -2983,13 +2981,13 @@
               <w:spacing w:after="120" w:line="276" w:lineRule="auto"/>
               <w:jc w:val="both"/>
               <w:rPr>
-                <w:ins w:id="9027" w:author="VNCN E&amp;C" w:date="2026-10-06T08:00:00Z"/>
+                <w:ins w:id="9033" w:author="VNCN E&amp;C" w:date="2026-10-06T08:00:00Z"/>
                 <w:rFonts w:ascii="Times New Roman" w:hAnsi="Times New Roman"/>
                 <w:sz w:val="26"/>
                 <w:szCs w:val="26"/>
               </w:rPr>
             </w:pPr>
-            <w:ins w:id="9028" w:author="VNCN E&amp;C" w:date="2026-10-06T08:00:00Z">
+            <w:ins w:id="9034" w:author="VNCN E&amp;C" w:date="2026-10-06T08:00:00Z">
               <w:r>
                 <w:rPr>
                   <w:rFonts w:ascii="Times New Roman" w:hAnsi="Times New Roman"/>
@@ -3026,13 +3024,13 @@
               <w:spacing w:after="120" w:line="276" w:lineRule="auto"/>
               <w:jc w:val="both"/>
               <w:rPr>
-                <w:ins w:id="9029" w:author="VNCN E&amp;C" w:date="2026-10-06T08:00:00Z"/>
+                <w:ins w:id="9035" w:author="VNCN E&amp;C" w:date="2026-10-06T08:00:00Z"/>
                 <w:rFonts w:ascii="Times New Roman" w:hAnsi="Times New Roman"/>
                 <w:sz w:val="26"/>
                 <w:szCs w:val="26"/>
               </w:rPr>
             </w:pPr>
-            <w:ins w:id="9030" w:author="VNCN E&amp;C" w:date="2026-10-06T08:00:00Z">
+            <w:ins w:id="9036" w:author="VNCN E&amp;C" w:date="2026-10-06T08:00:00Z">
               <w:r>
                 <w:rPr>
                   <w:rFonts w:ascii="Times New Roman" w:hAnsi="Times New Roman"/>
@@ -3348,7 +3346,7 @@
         </w:rPr>
         <w:t xml:space="preserve"> </w:t>
       </w:r>
-      <w:del w:id="9031" w:author="VNCN E&amp;C" w:date="2026-10-06T08:00:00Z">
+      <w:del w:id="9037" w:author="VNCN E&amp;C" w:date="2026-10-06T08:00:00Z">
         <w:r>
           <w:rPr>
             <w:rStyle w:val="StyleHeading3BoldCharCharCharCharCharCharCharCharCharCharCharCharCharCharChar"/>
@@ -3383,7 +3381,7 @@
           <w:delText>.</w:delText>
         </w:r>
       </w:del>
-      <w:ins w:id="9032" w:author="VNCN E&amp;C" w:date="2026-10-06T08:00:00Z">
+      <w:ins w:id="9038" w:author="VNCN E&amp;C" w:date="2026-10-06T08:00:00Z">
         <w:r>
           <w:rPr>
             <w:rStyle w:val="StyleHeading3BoldCharCharCharCharCharCharCharCharCharCharCharCharCharCharChar"/>
@@ -3914,18 +3912,19 @@
           <w:szCs w:val="26"/>
           <w:lang w:val="nl-NL" w:eastAsia="en-US"/>
         </w:rPr>
-        <w:t xml:space="preserve">1.12. Hợp đồng Chủ đầu tư:</w:t>
-      </w:r>
-      <w:r>
-        <w:rPr>
-          <w:rFonts w:ascii="Times New Roman" w:hAnsi="Times New Roman"/>
-          <w:sz w:val="26"/>
-          <w:szCs w:val="26"/>
-          <w:lang w:val="nl-NL"/>
-        </w:rPr>
-        <w:t xml:space="preserve"> </w:t>
-      </w:r>
-      <w:del w:id="9033" w:author="VNCN E&amp;C" w:date="2026-10-06T08:00:00Z">
+        <w:t xml:space="preserve">1.12. </w:t>
+      </w:r>
+      <w:del w:id="9039" w:author="VNCN E&amp;C" w:date="2026-10-06T08:00:00Z">
+        <w:r>
+          <w:rPr>
+            <w:rStyle w:val="StyleHeading3BoldCharCharCharCharCharCharCharCharCharCharCharCharCharCharChar"/>
+            <w:rFonts w:ascii="Times New Roman" w:hAnsi="Times New Roman"/>
+            <w:sz w:val="26"/>
+            <w:szCs w:val="26"/>
+            <w:lang w:val="nl-NL" w:eastAsia="en-US"/>
+          </w:rPr>
+          <w:delText xml:space="preserve">Hợp đồng Chủ đầu tư:</w:delText>
+        </w:r>
         <w:r>
           <w:rPr>
             <w:rFonts w:ascii="Times New Roman" w:hAnsi="Times New Roman"/>
@@ -3933,7 +3932,7 @@
             <w:szCs w:val="26"/>
             <w:lang w:val="nl-NL"/>
           </w:rPr>
-          <w:delText xml:space="preserve">là hợp đồng giữa Bên A và Liên danh</w:delText>
+          <w:delText xml:space="preserve"> là hợp đồng giữa Bên A và Liên danh</w:delText>
         </w:r>
         <w:r>
           <w:rPr>
@@ -3951,29 +3950,21 @@
             <w:szCs w:val="26"/>
             <w:lang w:val="nl-NL"/>
           </w:rPr>
-          <w:delText xml:space="preserve"> Công ty CP Đầu tư Tài chính và An ninh Công nghệ IFT và Công ty TNHH Phát triển Tiền Phong</w:delText>
+          <w:delText xml:space="preserve"> Công ty CP Đầu tư Tài chính và An ninh Công nghệ IFT và Công ty TNHH Phát triển Tiền Phong (sau đây gọi là “Hợp đồng thầu chính”).</w:delText>
         </w:r>
       </w:del>
-      <w:ins w:id="9034" w:author="VNCN E&amp;C" w:date="2026-10-06T08:00:00Z">
+      <w:ins w:id="9040" w:author="VNCN E&amp;C" w:date="2026-10-06T08:00:00Z">
         <w:r>
           <w:rPr>
+            <w:rStyle w:val="StyleHeading3BoldCharCharCharCharCharCharCharCharCharCharCharCharCharCharChar"/>
             <w:rFonts w:ascii="Times New Roman" w:hAnsi="Times New Roman"/>
             <w:sz w:val="26"/>
             <w:szCs w:val="26"/>
-            <w:lang w:val="nl-NL"/>
+            <w:lang w:val="nl-NL" w:eastAsia="en-US"/>
           </w:rPr>
-          <w:t xml:space="preserve">là Hợp đồng Tổng thầu thi công xây dựng số 01/2026/HĐTTXL/LDIFT-TP &amp; LD VNCNEC-VH ngày 16/7/2026 giữa Chủ đầu tư và Liên danh Tổng thầu, trong đó Bên A là thành viên, cùng các phụ lục, sửa đổi, bổ sung của hợp đồng đó</w:t>
+          <w:t xml:space="preserve">Thư giảm giá: là Thư giảm giá ngày 05/10/2026 của Bên B, là cơ sở xác định đơn giá cố định tại Biểu 01.</w:t>
         </w:r>
       </w:ins>
-      <w:r>
-        <w:rPr>
-          <w:rFonts w:ascii="Times New Roman" w:hAnsi="Times New Roman"/>
-          <w:sz w:val="26"/>
-          <w:szCs w:val="26"/>
-          <w:lang w:val="nl-NL"/>
-        </w:rPr>
-        <w:t xml:space="preserve"> (sau đây gọi là “Hợp đồng thầu chính”).</w:t>
-      </w:r>
     </w:p>
     <w:p>
       <w:pPr>
@@ -4260,7 +4251,7 @@
         </w:rPr>
         <w:t xml:space="preserve"> </w:t>
       </w:r>
-      <w:del w:id="9035" w:author="VNCN E&amp;C" w:date="2026-10-06T08:00:00Z">
+      <w:del w:id="9041" w:author="VNCN E&amp;C" w:date="2026-10-06T08:00:00Z">
         <w:r>
           <w:rPr>
             <w:rFonts w:ascii="Times New Roman" w:hAnsi="Times New Roman"/>
@@ -4272,7 +4263,7 @@
           <w:delText xml:space="preserve">Thi công công tác đất, cừ, văng chống, thi công kết cấu phần ngầm, hoàn thiện ướt phần ngầm (chống mối, chống thấm, xây, trát, ốp, lát, sơn, bả,..)</w:delText>
         </w:r>
       </w:del>
-      <w:ins w:id="9036" w:author="VNCN E&amp;C" w:date="2026-10-06T08:00:00Z">
+      <w:ins w:id="9042" w:author="VNCN E&amp;C" w:date="2026-10-06T08:00:00Z">
         <w:r>
           <w:rPr>
             <w:rFonts w:ascii="Times New Roman" w:hAnsi="Times New Roman"/>
@@ -4344,7 +4335,7 @@
         </w:rPr>
         <w:t xml:space="preserve"> </w:t>
       </w:r>
-      <w:del w:id="9037" w:author="VNCN E&amp;C" w:date="2026-10-06T08:00:00Z">
+      <w:del w:id="9043" w:author="VNCN E&amp;C" w:date="2026-10-06T08:00:00Z">
         <w:r>
           <w:rPr>
             <w:rFonts w:ascii="Times New Roman" w:hAnsi="Times New Roman"/>
@@ -4374,7 +4365,7 @@
           <w:delText xml:space="preserve"> và công tác hoàn thiện ướt các khu vực nằm dưới cao độ này (chống mối, chống thấm, xây, trát, ốp, lát, sơn, bả…) theo Hồ sơ thiết kế được duyệt. Ranh giới chi tiết theo Biểu 02 và Biểu 03. Kết cấu phần thân và hoàn thiện phần thân không thuộc phạm vi Hợp đồng này.</w:delText>
         </w:r>
       </w:del>
-      <w:ins w:id="9038" w:author="VNCN E&amp;C" w:date="2026-10-06T08:00:00Z">
+      <w:ins w:id="9044" w:author="VNCN E&amp;C" w:date="2026-10-06T08:00:00Z">
         <w:r>
           <w:rPr>
             <w:rFonts w:ascii="Times New Roman" w:hAnsi="Times New Roman"/>
@@ -4423,7 +4414,27 @@
           <w:szCs w:val="26"/>
           <w:lang w:val="nl-NL"/>
         </w:rPr>
-        <w:t>: là tập hợp các hồ sơ, tài liệu có liên quan tới quá trình thi công xây dựng Công trình được lập theo quy định của pháp luật về xây dựng, hợp đồng thầu chính, Chủ đầu tư và cơ quan có thẩm quyền.</w:t>
+        <w:t xml:space="preserve">: là tập hợp các hồ sơ, tài liệu có liên quan tới quá trình thi công xây dựng Công trình được lập theo quy định của pháp luật về xây dựng, </w:t>
+      </w:r>
+      <w:del w:id="9142" w:author="VNCN E&amp;C" w:date="2026-10-06T08:00:00Z">
+        <w:r>
+          <w:rPr>
+            <w:rFonts w:ascii="Times New Roman" w:hAnsi="Times New Roman"/>
+            <w:sz w:val="26"/>
+            <w:szCs w:val="26"/>
+            <w:lang w:val="nl-NL"/>
+          </w:rPr>
+          <w:delText xml:space="preserve">hợp đồng thầu chính, </w:delText>
+        </w:r>
+      </w:del>
+      <w:r>
+        <w:rPr>
+          <w:rFonts w:ascii="Times New Roman" w:hAnsi="Times New Roman"/>
+          <w:sz w:val="26"/>
+          <w:szCs w:val="26"/>
+          <w:lang w:val="nl-NL"/>
+        </w:rPr>
+        <w:t xml:space="preserve">Chủ đầu tư và cơ quan có thẩm quyền.</w:t>
       </w:r>
     </w:p>
     <w:p>
@@ -4485,7 +4496,7 @@
         </w:rPr>
         <w:t xml:space="preserve"> được định nghĩa tại Điều 16 </w:t>
       </w:r>
-      <w:del w:id="9039" w:author="VNCN E&amp;C" w:date="2026-10-06T08:00:00Z">
+      <w:del w:id="9045" w:author="VNCN E&amp;C" w:date="2026-10-06T08:00:00Z">
         <w:r>
           <w:rPr>
             <w:rFonts w:ascii="Times New Roman" w:hAnsi="Times New Roman"/>
@@ -4496,7 +4507,7 @@
           <w:delText xml:space="preserve">[Rủi ro và bất khả kháng]</w:delText>
         </w:r>
       </w:del>
-      <w:ins w:id="9040" w:author="VNCN E&amp;C" w:date="2026-10-06T08:00:00Z">
+      <w:ins w:id="9046" w:author="VNCN E&amp;C" w:date="2026-10-06T08:00:00Z">
         <w:r>
           <w:rPr>
             <w:rFonts w:ascii="Times New Roman" w:hAnsi="Times New Roman"/>
@@ -4603,28 +4614,90 @@
           <w:szCs w:val="26"/>
           <w:lang w:val="nl-NL"/>
         </w:rPr>
-        <w:t xml:space="preserve"> là địa điểm Chủ đầu tư giao cho Bên A để thi công công trình cũng như bất kỳ địa điểm nào khác được quy định trong hợp đồng.</w:t>
-      </w:r>
-    </w:p>
-    <w:p>
-      <w:pPr>
-        <w:spacing w:after="120" w:line="276" w:lineRule="auto"/>
-        <w:rPr>
-          <w:rFonts w:ascii="Times New Roman" w:hAnsi="Times New Roman"/>
-          <w:b/>
+        <w:t xml:space="preserve"> </w:t>
+      </w:r>
+      <w:del w:id="9143" w:author="VNCN E&amp;C" w:date="2026-10-06T08:00:00Z">
+        <w:r>
+          <w:rPr>
+            <w:rFonts w:ascii="Times New Roman" w:hAnsi="Times New Roman"/>
+            <w:sz w:val="26"/>
+            <w:szCs w:val="26"/>
+            <w:lang w:val="nl-NL"/>
+          </w:rPr>
+          <w:delText xml:space="preserve">là địa điểm Chủ đầu tư giao cho Bên A để thi công công trình</w:delText>
+        </w:r>
+      </w:del>
+      <w:ins w:id="9144" w:author="VNCN E&amp;C" w:date="2026-10-06T08:00:00Z">
+        <w:r>
+          <w:rPr>
+            <w:rFonts w:ascii="Times New Roman" w:hAnsi="Times New Roman"/>
+            <w:sz w:val="26"/>
+            <w:szCs w:val="26"/>
+            <w:lang w:val="nl-NL"/>
+          </w:rPr>
+          <w:t xml:space="preserve">là địa điểm Bên A bàn giao cho Bên B để thi công Hạng mục công trình</w:t>
+        </w:r>
+      </w:ins>
+      <w:r>
+        <w:rPr>
+          <w:rFonts w:ascii="Times New Roman" w:hAnsi="Times New Roman"/>
           <w:sz w:val="26"/>
           <w:szCs w:val="26"/>
           <w:lang w:val="nl-NL"/>
         </w:rPr>
-      </w:pPr>
-      <w:r>
-        <w:rPr>
-          <w:rFonts w:ascii="Times New Roman" w:hAnsi="Times New Roman"/>
+        <w:t xml:space="preserve"> cũng như bất kỳ địa điểm nào khác được quy định trong hợp đồng.</w:t>
+      </w:r>
+    </w:p>
+    <w:p>
+      <w:pPr>
+        <w:spacing w:after="120" w:line="276" w:lineRule="auto"/>
+        <w:rPr>
+          <w:rFonts w:ascii="Times New Roman" w:hAnsi="Times New Roman"/>
+          <w:b/>
           <w:sz w:val="26"/>
           <w:szCs w:val="26"/>
           <w:lang w:val="nl-NL"/>
         </w:rPr>
-        <w:t xml:space="preserve">1.24. Các từ ngữ khác chưa được định nghĩa ở Điều này sẽ được hiểu theo định nghĩa trong Hợp đồng thầu chính, quy định của Luật Xây dựng và các văn bản hướng dẫn.</w:t>
+      </w:pPr>
+      <w:r>
+        <w:rPr>
+          <w:rFonts w:ascii="Times New Roman" w:hAnsi="Times New Roman"/>
+          <w:sz w:val="26"/>
+          <w:szCs w:val="26"/>
+          <w:lang w:val="nl-NL"/>
+        </w:rPr>
+        <w:t xml:space="preserve">1.24. Các từ ngữ khác chưa được định nghĩa ở Điều này sẽ được hiểu theo </w:t>
+      </w:r>
+      <w:del w:id="9145" w:author="VNCN E&amp;C" w:date="2026-10-06T08:00:00Z">
+        <w:r>
+          <w:rPr>
+            <w:rFonts w:ascii="Times New Roman" w:hAnsi="Times New Roman"/>
+            <w:sz w:val="26"/>
+            <w:szCs w:val="26"/>
+            <w:lang w:val="nl-NL"/>
+          </w:rPr>
+          <w:delText xml:space="preserve">định nghĩa trong Hợp đồng thầu chính, quy định</w:delText>
+        </w:r>
+      </w:del>
+      <w:ins w:id="9146" w:author="VNCN E&amp;C" w:date="2026-10-06T08:00:00Z">
+        <w:r>
+          <w:rPr>
+            <w:rFonts w:ascii="Times New Roman" w:hAnsi="Times New Roman"/>
+            <w:sz w:val="26"/>
+            <w:szCs w:val="26"/>
+            <w:lang w:val="nl-NL"/>
+          </w:rPr>
+          <w:t xml:space="preserve">quy định</w:t>
+        </w:r>
+      </w:ins>
+      <w:r>
+        <w:rPr>
+          <w:rFonts w:ascii="Times New Roman" w:hAnsi="Times New Roman"/>
+          <w:sz w:val="26"/>
+          <w:szCs w:val="26"/>
+          <w:lang w:val="nl-NL"/>
+        </w:rPr>
+        <w:t xml:space="preserve"> của Luật Xây dựng và các văn bản hướng dẫn.</w:t>
       </w:r>
     </w:p>
     <w:p>
@@ -4729,7 +4802,7 @@
         </w:rPr>
         <w:t xml:space="preserve">b) Các Biểu chi tiết kèm theo </w:t>
       </w:r>
-      <w:del w:id="9041" w:author="VNCN E&amp;C" w:date="2026-10-06T08:00:00Z">
+      <w:del w:id="9047" w:author="VNCN E&amp;C" w:date="2026-10-06T08:00:00Z">
         <w:r>
           <w:rPr>
             <w:rFonts w:ascii="Times New Roman" w:hAnsi="Times New Roman"/>
@@ -4739,7 +4812,7 @@
           <w:delText xml:space="preserve">Hợp đồng; </w:delText>
         </w:r>
       </w:del>
-      <w:ins w:id="9042" w:author="VNCN E&amp;C" w:date="2026-10-06T08:00:00Z">
+      <w:ins w:id="9048" w:author="VNCN E&amp;C" w:date="2026-10-06T08:00:00Z">
         <w:r>
           <w:rPr>
             <w:rFonts w:ascii="Times New Roman" w:hAnsi="Times New Roman"/>
@@ -4809,7 +4882,7 @@
         </w:rPr>
         <w:t xml:space="preserve">e) Các tài liệu khác có liên quan</w:t>
       </w:r>
-      <w:del w:id="9043" w:author="VNCN E&amp;C" w:date="2026-10-06T08:00:00Z">
+      <w:del w:id="9049" w:author="VNCN E&amp;C" w:date="2026-10-06T08:00:00Z">
         <w:r>
           <w:rPr>
             <w:rFonts w:ascii="Times New Roman" w:hAnsi="Times New Roman"/>
@@ -4819,7 +4892,7 @@
           <w:delText xml:space="preserve"> (nếu có).</w:delText>
         </w:r>
       </w:del>
-      <w:ins w:id="9044" w:author="VNCN E&amp;C" w:date="2026-10-06T08:00:00Z">
+      <w:ins w:id="9050" w:author="VNCN E&amp;C" w:date="2026-10-06T08:00:00Z">
         <w:r>
           <w:rPr>
             <w:rFonts w:ascii="Times New Roman" w:hAnsi="Times New Roman"/>
@@ -4982,8 +5055,28 @@
           <w:sz w:val="26"/>
           <w:szCs w:val="26"/>
         </w:rPr>
-        <w:t>Trừ quy định tại khoản này, không bên nào được chuyển nhượng toàn bộ hoặc một phần Hợp đồng hoặc bất cứ phần lợi ích hoặc quyền lợi theo Hợp đồng.  Bên B không được giao thầu lại toàn bộ hoặc một phần công việc của Hợp đồng khi chưa có chấp thuận bằng văn bản của Bên A và chịu trách nhiệm toàn bộ đối với phần việc do nhà thầu phụ của mình thực hiện. Bên A được quyền chuyển giao quyền và nghĩa vụ theo Hợp đồng cho Chủ đầu tư hoặc đơn vị do Chủ đầu tư chỉ định sau khi thông báo bằng văn bản cho Bên B.</w:t>
-      </w:r>
+        <w:t xml:space="preserve">Trừ quy định tại khoản này, không bên nào được chuyển nhượng toàn bộ hoặc một phần Hợp đồng hoặc bất cứ phần lợi ích hoặc quyền lợi theo Hợp đồng.  </w:t>
+      </w:r>
+      <w:del w:id="9147" w:author="VNCN E&amp;C" w:date="2026-10-06T08:00:00Z">
+        <w:r>
+          <w:rPr>
+            <w:rFonts w:ascii="Times New Roman" w:hAnsi="Times New Roman"/>
+            <w:sz w:val="26"/>
+            <w:szCs w:val="26"/>
+          </w:rPr>
+          <w:delText xml:space="preserve">Bên B không được giao thầu lại toàn bộ hoặc một phần công việc của Hợp đồng khi chưa có chấp thuận bằng văn bản của Bên A và chịu trách nhiệm toàn bộ đối với phần việc do nhà thầu phụ của mình thực hiện. Bên A được quyền chuyển giao quyền và nghĩa vụ theo Hợp đồng cho Chủ đầu tư hoặc đơn vị do Chủ đầu tư chỉ định sau khi thông báo bằng văn bản cho Bên B.</w:delText>
+        </w:r>
+      </w:del>
+      <w:ins w:id="9148" w:author="VNCN E&amp;C" w:date="2026-10-06T08:00:00Z">
+        <w:r>
+          <w:rPr>
+            <w:rFonts w:ascii="Times New Roman" w:hAnsi="Times New Roman"/>
+            <w:sz w:val="26"/>
+            <w:szCs w:val="26"/>
+          </w:rPr>
+          <w:t xml:space="preserve">Bên B không được giao lại toàn bộ hoặc một phần công việc của Hợp đồng cho đơn vị khác khi chưa có chấp thuận bằng văn bản của Bên A và chịu trách nhiệm toàn bộ đối với phần việc do đơn vị đó thực hiện. Bên A được quyền chuyển giao quyền và nghĩa vụ theo Hợp đồng cho bên thứ ba sau khi thông báo bằng văn bản cho Bên B.</w:t>
+        </w:r>
+      </w:ins>
     </w:p>
     <w:p>
       <w:pPr>
@@ -5158,7 +5251,35 @@
           <w:sz w:val="26"/>
           <w:szCs w:val="26"/>
         </w:rPr>
-        <w:t>Hai bên đồng ý rằng, chi phí để Bên B thực hiện toàn bộ các nghĩa vụ, trách nhiệm của mình theo Hợp đồng này đã được tính đầy đủ trong giá Hợp đồng. Trường hợp Bên A phải thay Bên B thực hiện bất kỳ nghĩa vụ, trách nhiệm nào của Bên B theo Hợp đồng này thì Bên A có quyền đưa khoản chi phí thực tế, hợp lý, hợp lệ phát sinh vào giá trị khấu trừ trong giá Hợp đồng và/hoặc hồ sơ thanh toán của Bên B trên cơ sở hồ sơ, chứng từ thực tế. Bên A sẽ thông báo cho Bên B về căn cứ xác định giá trị khấu trừ để hai Bên đối chiếu, xác nhận; trường hợp cần xử lý ngay nhằm bảo đảm tiến độ, chất lượng, an toàn hoặc nghĩa vụ với Chủ đầu tư thì Bên A có quyền tạm khấu trừ trước và hai Bên sẽ hoàn tất việc đối chiếu trong kỳ thanh toán gần nhất.</w:t>
+        <w:t xml:space="preserve">Hai bên đồng ý rằng, chi phí để Bên B thực hiện toàn bộ các nghĩa vụ, trách nhiệm của mình theo Hợp đồng này đã được tính đầy đủ trong giá Hợp đồng. Trường hợp Bên A phải thay Bên B thực hiện bất kỳ nghĩa vụ, trách nhiệm nào của Bên B theo Hợp đồng này thì Bên A có quyền đưa khoản chi phí thực tế, hợp lý, hợp lệ phát sinh vào giá trị khấu trừ trong giá Hợp đồng và/hoặc hồ sơ thanh toán của Bên B trên cơ sở hồ sơ, chứng từ thực tế. Bên A sẽ thông báo cho Bên B về căn cứ xác định giá trị khấu trừ để hai Bên đối chiếu, xác nhận; trường hợp cần xử lý ngay nhằm bảo đảm tiến độ, chất lượng, an toàn hoặc </w:t>
+      </w:r>
+      <w:del w:id="9149" w:author="VNCN E&amp;C" w:date="2026-10-06T08:00:00Z">
+        <w:r>
+          <w:rPr>
+            <w:rFonts w:ascii="Times New Roman" w:hAnsi="Times New Roman"/>
+            <w:sz w:val="26"/>
+            <w:szCs w:val="26"/>
+          </w:rPr>
+          <w:delText xml:space="preserve">nghĩa vụ với Chủ đầu tư</w:delText>
+        </w:r>
+      </w:del>
+      <w:ins w:id="9150" w:author="VNCN E&amp;C" w:date="2026-10-06T08:00:00Z">
+        <w:r>
+          <w:rPr>
+            <w:rFonts w:ascii="Times New Roman" w:hAnsi="Times New Roman"/>
+            <w:sz w:val="26"/>
+            <w:szCs w:val="26"/>
+          </w:rPr>
+          <w:t xml:space="preserve">yêu cầu của Dự án</w:t>
+        </w:r>
+      </w:ins>
+      <w:r>
+        <w:rPr>
+          <w:rFonts w:ascii="Times New Roman" w:hAnsi="Times New Roman"/>
+          <w:sz w:val="26"/>
+          <w:szCs w:val="26"/>
+        </w:rPr>
+        <w:t xml:space="preserve"> thì Bên A có quyền tạm khấu trừ trước và hai Bên sẽ hoàn tất việc đối chiếu trong kỳ thanh toán gần nhất.</w:t>
       </w:r>
     </w:p>
     <w:p>
@@ -5291,7 +5412,7 @@
         </w:rPr>
         <w:t xml:space="preserve"> Bên A giao và Bên B đồng ý nhận thi công Gói thầu P.001: </w:t>
       </w:r>
-      <w:del w:id="9045" w:author="VNCN E&amp;C" w:date="2026-10-06T08:00:00Z">
+      <w:del w:id="9051" w:author="VNCN E&amp;C" w:date="2026-10-06T08:00:00Z">
         <w:r>
           <w:rPr>
             <w:rFonts w:ascii="Times New Roman" w:hAnsi="Times New Roman"/>
@@ -5302,7 +5423,7 @@
           <w:delText xml:space="preserve">Thi công công tác đất, cừ, văng chống, thi công kết cấu phần ngầm, hoàn thiện ướt phần ngầm (chống mối, chống thấm, xây, trát, ốp, lát, sơn, bả,..)</w:delText>
         </w:r>
       </w:del>
-      <w:ins w:id="9046" w:author="VNCN E&amp;C" w:date="2026-10-06T08:00:00Z">
+      <w:ins w:id="9052" w:author="VNCN E&amp;C" w:date="2026-10-06T08:00:00Z">
         <w:r>
           <w:rPr>
             <w:rFonts w:ascii="Times New Roman" w:hAnsi="Times New Roman"/>
@@ -5500,24 +5621,38 @@
           <w:szCs w:val="26"/>
         </w:rPr>
       </w:pPr>
-      <w:r>
-        <w:rPr>
-          <w:rFonts w:ascii="Times New Roman" w:hAnsi="Times New Roman"/>
-          <w:b/>
-          <w:bCs/>
-          <w:sz w:val="26"/>
-          <w:szCs w:val="26"/>
-        </w:rPr>
-        <w:t>4.3.</w:t>
-      </w:r>
-      <w:r>
-        <w:rPr>
-          <w:rFonts w:ascii="Times New Roman" w:hAnsi="Times New Roman"/>
-          <w:sz w:val="26"/>
-          <w:szCs w:val="26"/>
-        </w:rPr>
-        <w:t xml:space="preserve"> Trong phạm vi công việc theo Hợp đồng này, Bên B có trách nhiệm tuân thủ các yêu cầu có liên quan của Hợp đồng Chủ đầu tư (trừ các điều khoản tài chính), Hồ sơ thiết kế, Chỉ dẫn kỹ thuật và các chỉ dẫn hợp pháp của Chủ đầu tư/Tư vấn giám sát/Bên A đã được Bên A chuyển giao hoặc thông báo cho Bên B. Trường hợp do lỗi của Bên B làm phát sinh việc Chủ đầu tư từ chối nghiệm thu, giảm trừ thanh toán, yêu cầu sửa chữa, bồi thường hoặc áp dụng chế tài đối với Bên A thì Bên B có trách nhiệm phối hợp khắc phục và hoàn trả cho Bên A các chi phí, thiệt hại hợp lý, hợp lệ phát sinh tương ứng.</w:t>
-      </w:r>
+      <w:del w:id="9151" w:author="VNCN E&amp;C" w:date="2026-10-06T08:00:00Z">
+        <w:r>
+          <w:rPr>
+            <w:rFonts w:ascii="Times New Roman" w:hAnsi="Times New Roman"/>
+            <w:b/>
+            <w:bCs/>
+            <w:sz w:val="26"/>
+            <w:szCs w:val="26"/>
+          </w:rPr>
+          <w:delText>4.3.</w:delText>
+        </w:r>
+        <w:r>
+          <w:rPr>
+            <w:rFonts w:ascii="Times New Roman" w:hAnsi="Times New Roman"/>
+            <w:sz w:val="26"/>
+            <w:szCs w:val="26"/>
+          </w:rPr>
+          <w:delText xml:space="preserve"> Trong phạm vi công việc theo Hợp đồng này, Bên B có trách nhiệm tuân thủ các yêu cầu có liên quan của Hợp đồng Chủ đầu tư (trừ các điều khoản tài chính), Hồ sơ thiết kế, Chỉ dẫn kỹ thuật và các chỉ dẫn hợp pháp của Chủ đầu tư/Tư vấn giám sát/Bên A đã được Bên A chuyển giao hoặc thông báo cho Bên B. Trường hợp do lỗi của Bên B làm phát sinh việc Chủ đầu tư từ chối nghiệm thu, giảm trừ thanh toán, yêu cầu sửa chữa, bồi thường hoặc áp dụng chế tài đối với Bên A thì Bên B có trách nhiệm phối hợp khắc phục và hoàn trả cho Bên A các chi phí, thiệt hại hợp lý, hợp lệ phát sinh tương ứng.</w:delText>
+        </w:r>
+      </w:del>
+      <w:ins w:id="9152" w:author="VNCN E&amp;C" w:date="2026-10-06T08:00:00Z">
+        <w:r>
+          <w:rPr>
+            <w:rFonts w:ascii="Times New Roman" w:hAnsi="Times New Roman"/>
+            <w:b/>
+            <w:bCs/>
+            <w:sz w:val="26"/>
+            <w:szCs w:val="26"/>
+          </w:rPr>
+          <w:t xml:space="preserve">4.3. Trong phạm vi công việc theo Hợp đồng này, Bên B có trách nhiệm tuân thủ Hồ sơ thiết kế, Chỉ dẫn kỹ thuật, các yêu cầu của Dự án và các chỉ dẫn hợp pháp của Chủ đầu tư, Tư vấn giám sát, Bên A được Bên A thông báo cho Bên B. Trường hợp do lỗi của Bên B mà Bên A bị từ chối nghiệm thu, giảm trừ giá trị, yêu cầu sửa chữa, bồi thường hoặc áp dụng chế tài thì Bên B có trách nhiệm khắc phục và hoàn trả cho Bên A toàn bộ chi phí, thiệt hại phát sinh tương ứng.</w:t>
+        </w:r>
+      </w:ins>
     </w:p>
     <w:p>
       <w:pPr>
@@ -5625,13 +5760,13 @@
         <w:spacing w:after="120" w:line="276" w:lineRule="auto"/>
         <w:jc w:val="both"/>
         <w:rPr>
-          <w:ins w:id="9047" w:author="VNCN E&amp;C" w:date="2026-10-06T08:00:00Z"/>
-          <w:rFonts w:ascii="Times New Roman" w:hAnsi="Times New Roman"/>
-          <w:sz w:val="26"/>
-          <w:szCs w:val="26"/>
-        </w:rPr>
-      </w:pPr>
-      <w:ins w:id="9048" w:author="VNCN E&amp;C" w:date="2026-10-06T08:00:00Z">
+          <w:ins w:id="9053" w:author="VNCN E&amp;C" w:date="2026-10-06T08:00:00Z"/>
+          <w:rFonts w:ascii="Times New Roman" w:hAnsi="Times New Roman"/>
+          <w:sz w:val="26"/>
+          <w:szCs w:val="26"/>
+        </w:rPr>
+      </w:pPr>
+      <w:ins w:id="9054" w:author="VNCN E&amp;C" w:date="2026-10-06T08:00:00Z">
         <w:r>
           <w:rPr>
             <w:rFonts w:ascii="Times New Roman" w:hAnsi="Times New Roman"/>
@@ -6412,14 +6547,14 @@
         <w:spacing w:after="120" w:line="276" w:lineRule="auto"/>
         <w:jc w:val="both"/>
         <w:rPr>
-          <w:ins w:id="9049" w:author="VNCN E&amp;C" w:date="2026-10-06T08:00:00Z"/>
+          <w:ins w:id="9055" w:author="VNCN E&amp;C" w:date="2026-10-06T08:00:00Z"/>
           <w:rFonts w:ascii="Times New Roman" w:hAnsi="Times New Roman"/>
           <w:sz w:val="26"/>
           <w:szCs w:val="26"/>
           <w:highlight w:val="yellow"/>
         </w:rPr>
       </w:pPr>
-      <w:ins w:id="9050" w:author="VNCN E&amp;C" w:date="2026-10-06T08:00:00Z">
+      <w:ins w:id="9056" w:author="VNCN E&amp;C" w:date="2026-10-06T08:00:00Z">
         <w:r>
           <w:rPr>
             <w:rFonts w:ascii="Times New Roman" w:hAnsi="Times New Roman"/>
@@ -6450,7 +6585,7 @@
         </w:rPr>
         <w:t xml:space="preserve">- Bắt đầu đào đất phần ngầm:</w:t>
       </w:r>
-      <w:ins w:id="9051" w:author="VNCN E&amp;C" w:date="2026-10-06T08:00:00Z">
+      <w:ins w:id="9057" w:author="VNCN E&amp;C" w:date="2026-10-06T08:00:00Z">
         <w:r>
           <w:rPr>
             <w:rFonts w:ascii="Times New Roman" w:hAnsi="Times New Roman"/>
@@ -6498,7 +6633,7 @@
         </w:rPr>
         <w:t xml:space="preserve">- Hoàn thành kết cấu phần ngầm đến cao độ ±0.00:</w:t>
       </w:r>
-      <w:ins w:id="9052" w:author="VNCN E&amp;C" w:date="2026-10-06T08:00:00Z">
+      <w:ins w:id="9058" w:author="VNCN E&amp;C" w:date="2026-10-06T08:00:00Z">
         <w:r>
           <w:rPr>
             <w:rFonts w:ascii="Times New Roman" w:hAnsi="Times New Roman"/>
@@ -6545,7 +6680,7 @@
         </w:rPr>
         <w:t xml:space="preserve">- </w:t>
       </w:r>
-      <w:del w:id="9053" w:author="VNCN E&amp;C" w:date="2026-10-06T08:00:00Z">
+      <w:del w:id="9059" w:author="VNCN E&amp;C" w:date="2026-10-06T08:00:00Z">
         <w:r>
           <w:rPr>
             <w:rFonts w:ascii="Times New Roman" w:hAnsi="Times New Roman"/>
@@ -6556,7 +6691,7 @@
           <w:delText xml:space="preserve">Hoàn thành hoàn thiện ướt phần ngầm và bàn giao Hạng mục công trình:</w:delText>
         </w:r>
       </w:del>
-      <w:ins w:id="9054" w:author="VNCN E&amp;C" w:date="2026-10-06T08:00:00Z">
+      <w:ins w:id="9060" w:author="VNCN E&amp;C" w:date="2026-10-06T08:00:00Z">
         <w:r>
           <w:rPr>
             <w:rFonts w:ascii="Times New Roman" w:hAnsi="Times New Roman"/>
@@ -6592,14 +6727,14 @@
         <w:spacing w:after="120" w:line="276" w:lineRule="auto"/>
         <w:jc w:val="both"/>
         <w:rPr>
-          <w:ins w:id="9055" w:author="VNCN E&amp;C" w:date="2026-10-06T08:00:00Z"/>
+          <w:ins w:id="9061" w:author="VNCN E&amp;C" w:date="2026-10-06T08:00:00Z"/>
           <w:rFonts w:ascii="Times New Roman" w:hAnsi="Times New Roman"/>
           <w:sz w:val="26"/>
           <w:szCs w:val="26"/>
           <w:highlight w:val="yellow"/>
         </w:rPr>
       </w:pPr>
-      <w:ins w:id="9056" w:author="VNCN E&amp;C" w:date="2026-10-06T08:00:00Z">
+      <w:ins w:id="9062" w:author="VNCN E&amp;C" w:date="2026-10-06T08:00:00Z">
         <w:r>
           <w:rPr>
             <w:rFonts w:ascii="Times New Roman" w:hAnsi="Times New Roman"/>
@@ -6659,7 +6794,7 @@
           <w:szCs w:val="26"/>
         </w:rPr>
       </w:pPr>
-      <w:del w:id="9057" w:author="VNCN E&amp;C" w:date="2026-10-06T08:00:00Z">
+      <w:del w:id="9063" w:author="VNCN E&amp;C" w:date="2026-10-06T08:00:00Z">
         <w:r>
           <w:rPr>
             <w:rFonts w:ascii="Times New Roman" w:hAnsi="Times New Roman"/>
@@ -6685,7 +6820,7 @@
           <w:delText>từ khi Bên A thông báo bàn giao mặt bằng cho Bên B; Tiến độ thi công phải được Bên A chấp thuận.</w:delText>
         </w:r>
       </w:del>
-      <w:ins w:id="9058" w:author="VNCN E&amp;C" w:date="2026-10-06T08:00:00Z">
+      <w:ins w:id="9064" w:author="VNCN E&amp;C" w:date="2026-10-06T08:00:00Z">
         <w:r>
           <w:rPr>
             <w:rFonts w:ascii="Times New Roman" w:hAnsi="Times New Roman"/>
@@ -6709,7 +6844,7 @@
           <w:szCs w:val="26"/>
         </w:rPr>
       </w:pPr>
-      <w:del w:id="9059" w:author="VNCN E&amp;C" w:date="2026-10-06T08:00:00Z">
+      <w:del w:id="9065" w:author="VNCN E&amp;C" w:date="2026-10-06T08:00:00Z">
         <w:r>
           <w:rPr>
             <w:rFonts w:ascii="Times New Roman" w:hAnsi="Times New Roman"/>
@@ -6797,7 +6932,35 @@
           <w:sz w:val="26"/>
           <w:szCs w:val="26"/>
         </w:rPr>
-        <w:t>Bên B phải huy động máy móc, trang thiết bị, nguyên vật liệu, nhân công đầy đủ để thực hiện công việc theo yêu cầu của Bên A trong thời gian quy định. Bên B phải thực hiện công việc của Hợp đồng đúng thời gian và phương thức như vậy để Bên A có thể hoàn thành công việc trong hợp đồng thầu chính;</w:t>
+        <w:t xml:space="preserve">Bên B phải huy động máy móc, trang thiết bị, nguyên vật liệu, nhân công đầy đủ để thực hiện công việc theo yêu cầu của Bên A trong thời gian quy định. Bên B phải thực hiện công việc của Hợp đồng đúng thời gian và phương thức như vậy </w:t>
+      </w:r>
+      <w:del w:id="9153" w:author="VNCN E&amp;C" w:date="2026-10-06T08:00:00Z">
+        <w:r>
+          <w:rPr>
+            <w:rFonts w:ascii="Times New Roman" w:hAnsi="Times New Roman"/>
+            <w:sz w:val="26"/>
+            <w:szCs w:val="26"/>
+          </w:rPr>
+          <w:delText xml:space="preserve">để Bên A có thể hoàn thành công việc trong hợp đồng thầu chính</w:delText>
+        </w:r>
+      </w:del>
+      <w:ins w:id="9154" w:author="VNCN E&amp;C" w:date="2026-10-06T08:00:00Z">
+        <w:r>
+          <w:rPr>
+            <w:rFonts w:ascii="Times New Roman" w:hAnsi="Times New Roman"/>
+            <w:sz w:val="26"/>
+            <w:szCs w:val="26"/>
+          </w:rPr>
+          <w:t xml:space="preserve">phù hợp tổng tiến độ của Dự án</w:t>
+        </w:r>
+      </w:ins>
+      <w:r>
+        <w:rPr>
+          <w:rFonts w:ascii="Times New Roman" w:hAnsi="Times New Roman"/>
+          <w:sz w:val="26"/>
+          <w:szCs w:val="26"/>
+        </w:rPr>
+        <w:t xml:space="preserve">;</w:t>
       </w:r>
     </w:p>
     <w:p>
@@ -6922,8 +7085,50 @@
           <w:szCs w:val="26"/>
         </w:rPr>
         <w:t xml:space="preserve">a) Trường hợp Bên B kéo dài thời gian thi công hơn thời gian đã quy định nêu trên và trong tiến độ đã được Bên A thống nhất mà không được sự chấp thuận bằng văn bản của Bên A thì coi như vi phạm tiến độ thực hiện Hợp đồng và phải chịu phạt theo các quy định về phạt vi phạm tiến độ trong Hợp đồng. Ngoài ra, Bên B còn phải bồi thường toàn </w:t>
+      </w:r>
+      <w:r>
+        <w:rPr>
+          <w:rFonts w:ascii="Times New Roman" w:hAnsi="Times New Roman"/>
+          <w:sz w:val="26"/>
+          <w:szCs w:val="26"/>
+        </w:rPr>
         <w:lastRenderedPageBreak/>
-        <w:t>bộ các chi phí mà Bên A bị thiệt hại và bị Chủ đầu tư phạt chậm tiến độ do việc chậm tiến độ của Bên B gây ra.</w:t>
+      </w:r>
+      <w:r>
+        <w:rPr>
+          <w:rFonts w:ascii="Times New Roman" w:hAnsi="Times New Roman"/>
+          <w:sz w:val="26"/>
+          <w:szCs w:val="26"/>
+        </w:rPr>
+        <w:t xml:space="preserve">bộ các chi phí mà Bên A bị thiệt hại </w:t>
+      </w:r>
+      <w:del w:id="9155" w:author="VNCN E&amp;C" w:date="2026-10-06T08:00:00Z">
+        <w:r>
+          <w:rPr>
+            <w:rFonts w:ascii="Times New Roman" w:hAnsi="Times New Roman"/>
+            <w:sz w:val="26"/>
+            <w:szCs w:val="26"/>
+          </w:rPr>
+          <w:delText xml:space="preserve">và bị Chủ đầu tư phạt chậm tiến độ</w:delText>
+        </w:r>
+      </w:del>
+      <w:ins w:id="9156" w:author="VNCN E&amp;C" w:date="2026-10-06T08:00:00Z">
+        <w:r>
+          <w:rPr>
+            <w:rFonts w:ascii="Times New Roman" w:hAnsi="Times New Roman"/>
+            <w:sz w:val="26"/>
+            <w:szCs w:val="26"/>
+          </w:rPr>
+          <w:t xml:space="preserve">và các khoản Bên A phải chịu phạt, bồi thường đối với bên thứ ba</w:t>
+        </w:r>
+      </w:ins>
+      <w:r>
+        <w:rPr>
+          <w:rFonts w:ascii="Times New Roman" w:hAnsi="Times New Roman"/>
+          <w:sz w:val="26"/>
+          <w:szCs w:val="26"/>
+        </w:rPr>
+        <w:t xml:space="preserve"> do việc chậm tiến độ của Bên B gây ra.</w:t>
       </w:r>
     </w:p>
     <w:p>
@@ -7133,7 +7338,7 @@
         </w:rPr>
         <w:t xml:space="preserve">Thời hạn bảo hành: 24 tháng </w:t>
       </w:r>
-      <w:del w:id="9060" w:author="VNCN E&amp;C" w:date="2026-10-06T08:00:00Z">
+      <w:del w:id="9066" w:author="VNCN E&amp;C" w:date="2026-10-06T08:00:00Z">
         <w:r>
           <w:rPr>
             <w:rFonts w:ascii="Times New Roman" w:hAnsi="Times New Roman"/>
@@ -7144,7 +7349,7 @@
           <w:delText xml:space="preserve">(riêng công tác chống thấm: …… tháng) kể từ ngày Chủ đầu tư nghiệm thu</w:delText>
         </w:r>
       </w:del>
-      <w:ins w:id="9061" w:author="VNCN E&amp;C" w:date="2026-10-06T08:00:00Z">
+      <w:ins w:id="9067" w:author="VNCN E&amp;C" w:date="2026-10-06T08:00:00Z">
         <w:r>
           <w:rPr>
             <w:rFonts w:ascii="Times New Roman" w:hAnsi="Times New Roman"/>
@@ -7168,7 +7373,7 @@
             <w:sz w:val="26"/>
             <w:szCs w:val="26"/>
           </w:rPr>
-          <w:t xml:space="preserve"> tháng theo Hợp đồng thầu chính) kể từ ngày Chủ đầu tư ký biên bản nghiệm thu</w:t>
+          <w:t xml:space="preserve"> tháng) kể từ ngày Chủ đầu tư ký biên bản nghiệm thu</w:t>
         </w:r>
       </w:ins>
       <w:r>
@@ -7178,16 +7383,27 @@
           <w:szCs w:val="26"/>
           <w:highlight w:val="yellow"/>
         </w:rPr>
-        <w:t xml:space="preserve"> hoàn thành toàn bộ Công trình đưa vào sử dụng, nhưng không ngắn hơn thời hạn bảo hành tương ứng mà Bên A phải chịu theo Hợp đồng thầu chính.</w:t>
-      </w:r>
-      <w:ins w:id="9062" w:author="VNCN E&amp;C" w:date="2026-10-06T08:00:00Z">
+        <w:t xml:space="preserve"> hoàn thành toàn bộ Công trình đưa vào sử dụng</w:t>
+      </w:r>
+      <w:del w:id="9068" w:author="VNCN E&amp;C" w:date="2026-10-06T08:00:00Z">
+        <w:r>
+          <w:rPr>
+            <w:rFonts w:ascii="Times New Roman" w:hAnsi="Times New Roman"/>
+            <w:sz w:val="26"/>
+            <w:szCs w:val="26"/>
+            <w:highlight w:val="yellow"/>
+          </w:rPr>
+          <w:delText xml:space="preserve">, nhưng không ngắn hơn thời hạn bảo hành tương ứng mà Bên A phải chịu theo Hợp đồng thầu chính.</w:delText>
+        </w:r>
+      </w:del>
+      <w:ins w:id="9069" w:author="VNCN E&amp;C" w:date="2026-10-06T08:00:00Z">
         <w:r>
           <w:rPr>
             <w:rFonts w:ascii="Times New Roman" w:hAnsi="Times New Roman"/>
             <w:sz w:val="26"/>
             <w:szCs w:val="26"/>
           </w:rPr>
-          <w:t xml:space="preserve"> Phạm vi, điều kiện và trách nhiệm bảo hành áp dụng tương ứng với Hợp đồng thầu chính đối với phần việc của Bên B.</w:t>
+          <w:t xml:space="preserve">.</w:t>
         </w:r>
       </w:ins>
     </w:p>
@@ -7303,7 +7519,7 @@
         </w:rPr>
         <w:t xml:space="preserve">(iii) Bên B sẽ được hoàn trả khoản tiền giữ lại bảo hành sau khi kết thúc thời hạn bảo hành và được Bên A xác nhận đã hoàn thành công việc bảo hành. Trường hợp Bên B phát hành bảo lãnh bảo hành có giá trị tương đương số tiền bảo hành như quy định tại Điều 20 thì Bên A hoàn trả khoản tiền giữ lại bảo hành </w:t>
       </w:r>
-      <w:del w:id="9063" w:author="VNCN E&amp;C" w:date="2026-10-06T08:00:00Z">
+      <w:del w:id="9070" w:author="VNCN E&amp;C" w:date="2026-10-06T08:00:00Z">
         <w:r>
           <w:rPr>
             <w:rFonts w:ascii="Times New Roman" w:hAnsi="Times New Roman"/>
@@ -7313,7 +7529,7 @@
           <w:delText xml:space="preserve">theo Điều 10.3.2 </w:delText>
         </w:r>
       </w:del>
-      <w:ins w:id="9064" w:author="VNCN E&amp;C" w:date="2026-10-06T08:00:00Z">
+      <w:ins w:id="9071" w:author="VNCN E&amp;C" w:date="2026-10-06T08:00:00Z">
         <w:r>
           <w:rPr>
             <w:rFonts w:ascii="Times New Roman" w:hAnsi="Times New Roman"/>
@@ -7399,7 +7615,7 @@
         </w:rPr>
         <w:t xml:space="preserve">Hợp đồng theo đơn giá cố định. Đơn giá không điều chỉnh trong suốt thời gian thực hiện Hợp đồng, kể cả khi có biến động giá vật liệu, nhân công, nhiên liệu, </w:t>
       </w:r>
-      <w:del w:id="9065" w:author="VNCN E&amp;C" w:date="2026-10-06T08:00:00Z">
+      <w:del w:id="9072" w:author="VNCN E&amp;C" w:date="2026-10-06T08:00:00Z">
         <w:r>
           <w:rPr>
             <w:rFonts w:ascii="Times New Roman" w:hAnsi="Times New Roman"/>
@@ -7409,14 +7625,14 @@
           <w:delText xml:space="preserve">trừ trường hợp Bên A được Chủ đầu tư chấp thuận điều chỉnh tương ứng theo Hợp đồng thầu chính.</w:delText>
         </w:r>
       </w:del>
-      <w:ins w:id="9066" w:author="VNCN E&amp;C" w:date="2026-10-06T08:00:00Z">
+      <w:ins w:id="9073" w:author="VNCN E&amp;C" w:date="2026-10-06T08:00:00Z">
         <w:r>
           <w:rPr>
             <w:rFonts w:ascii="Times New Roman" w:hAnsi="Times New Roman"/>
             <w:sz w:val="26"/>
             <w:szCs w:val="26"/>
           </w:rPr>
-          <w:t xml:space="preserve">trừ trường hợp pháp luật bắt buộc điều chỉnh và Chủ đầu tư chấp thuận điều chỉnh tương ứng cho Bên A theo Hợp đồng thầu chính; giá trị điều chỉnh cho Bên B không vượt quá giá trị Bên A được điều chỉnh tương ứng. Giá trị quyết toán bằng khối lượng thực tế hoàn thành được nghiệm thu nhân với đơn giá cố định tại Biểu 01 (theo Thư giảm giá ngày 05/10/2026 của Bên B).</w:t>
+          <w:t xml:space="preserve">trừ trường hợp pháp luật bắt buộc điều chỉnh và được Bên A chấp thuận bằng văn bản; giá trị điều chỉnh không vượt quá mức được Chủ đầu tư Dự án chấp thuận đối với phần công việc tương ứng. Giá trị quyết toán bằng khối lượng thực tế hoàn thành được nghiệm thu nhân với đơn giá cố định tại Biểu 01 (theo Thư giảm giá ngày 05/10/2026 của Bên B).</w:t>
         </w:r>
       </w:ins>
     </w:p>
@@ -7516,7 +7732,7 @@
         </w:rPr>
         <w:t xml:space="preserve">a) Giá hợp đồng (tạm tính): </w:t>
       </w:r>
-      <w:del w:id="9067" w:author="VNCN E&amp;C" w:date="2026-10-06T08:00:00Z">
+      <w:del w:id="9074" w:author="VNCN E&amp;C" w:date="2026-10-06T08:00:00Z">
         <w:r>
           <w:rPr>
             <w:rFonts w:ascii="Times New Roman" w:hAnsi="Times New Roman"/>
@@ -7535,7 +7751,7 @@
           <w:delText xml:space="preserve"> </w:delText>
         </w:r>
       </w:del>
-      <w:ins w:id="9068" w:author="VNCN E&amp;C" w:date="2026-10-06T08:00:00Z">
+      <w:ins w:id="9075" w:author="VNCN E&amp;C" w:date="2026-10-06T08:00:00Z">
         <w:r>
           <w:rPr>
             <w:rFonts w:ascii="Times New Roman" w:hAnsi="Times New Roman"/>
@@ -7654,7 +7870,7 @@
         </w:rPr>
         <w:t xml:space="preserve">(1) </w:t>
       </w:r>
-      <w:del w:id="9069" w:author="VNCN E&amp;C" w:date="2026-10-06T08:00:00Z">
+      <w:del w:id="9076" w:author="VNCN E&amp;C" w:date="2026-10-06T08:00:00Z">
         <w:r>
           <w:rPr>
             <w:rFonts w:ascii="Times New Roman" w:hAnsi="Times New Roman"/>
@@ -7664,7 +7880,7 @@
           <w:delText xml:space="preserve">Thuế giá trị gia tăng theo quy định hiện hành, các khoản thuế, phí khác có liên quan;</w:delText>
         </w:r>
       </w:del>
-      <w:ins w:id="9070" w:author="VNCN E&amp;C" w:date="2026-10-06T08:00:00Z">
+      <w:ins w:id="9077" w:author="VNCN E&amp;C" w:date="2026-10-06T08:00:00Z">
         <w:r>
           <w:rPr>
             <w:rFonts w:ascii="Times New Roman" w:hAnsi="Times New Roman"/>
@@ -8050,7 +8266,7 @@
         </w:rPr>
         <w:t xml:space="preserve">ồng với số tiền </w:t>
       </w:r>
-      <w:del w:id="9071" w:author="VNCN E&amp;C" w:date="2026-10-06T08:00:00Z">
+      <w:del w:id="9078" w:author="VNCN E&amp;C" w:date="2026-10-06T08:00:00Z">
         <w:r>
           <w:rPr>
             <w:rFonts w:ascii="Times New Roman" w:hAnsi="Times New Roman"/>
@@ -8097,7 +8313,7 @@
           <w:delText xml:space="preserve">m (10%)</w:delText>
         </w:r>
       </w:del>
-      <w:ins w:id="9072" w:author="VNCN E&amp;C" w:date="2026-10-06T08:00:00Z">
+      <w:ins w:id="9079" w:author="VNCN E&amp;C" w:date="2026-10-06T08:00:00Z">
         <w:r>
           <w:rPr>
             <w:rFonts w:ascii="Times New Roman" w:hAnsi="Times New Roman"/>
@@ -8595,7 +8811,7 @@
         </w:rPr>
         <w:t xml:space="preserve"> Bên A sẽ thanh toán cho Bên B đến 90% giá trị hoàn thành theo đợt </w:t>
       </w:r>
-      <w:del w:id="9073" w:author="VNCN E&amp;C" w:date="2026-10-06T08:00:00Z">
+      <w:del w:id="9080" w:author="VNCN E&amp;C" w:date="2026-10-06T08:00:00Z">
         <w:r>
           <w:rPr>
             <w:rFonts w:ascii="Times New Roman" w:hAnsi="Times New Roman"/>
@@ -8605,7 +8821,7 @@
           <w:delText xml:space="preserve">(giá trị hoàn thành Bên B đề nghị thanh toán các đợt phải đạt tối thiểu 2 tỷ đồng)</w:delText>
         </w:r>
       </w:del>
-      <w:ins w:id="9074" w:author="VNCN E&amp;C" w:date="2026-10-06T08:00:00Z">
+      <w:ins w:id="9081" w:author="VNCN E&amp;C" w:date="2026-10-06T08:00:00Z">
         <w:r>
           <w:rPr>
             <w:rFonts w:ascii="Times New Roman" w:hAnsi="Times New Roman"/>
@@ -9421,7 +9637,7 @@
           <w:szCs w:val="26"/>
         </w:rPr>
       </w:pPr>
-      <w:del w:id="9075" w:author="VNCN E&amp;C" w:date="2026-10-06T08:00:00Z">
+      <w:del w:id="9082" w:author="VNCN E&amp;C" w:date="2026-10-06T08:00:00Z">
         <w:r>
           <w:rPr>
             <w:rFonts w:ascii="Times New Roman" w:hAnsi="Times New Roman"/>
@@ -9431,14 +9647,48 @@
           <w:delText xml:space="preserve">- Hồ sơ nghiệm thu chất lượng, Bảng nghiệm thu khối lượng hoàn thành: Bên A xem xét, xác nhận trong vòng 14 ngày kể từ ngày nhận đủ hồ sơ hợp lệ.</w:delText>
         </w:r>
       </w:del>
-      <w:ins w:id="9076" w:author="VNCN E&amp;C" w:date="2026-10-06T08:00:00Z">
+      <w:ins w:id="9083" w:author="VNCN E&amp;C" w:date="2026-10-06T08:00:00Z">
         <w:r>
           <w:rPr>
             <w:rFonts w:ascii="Times New Roman" w:hAnsi="Times New Roman"/>
             <w:sz w:val="26"/>
             <w:szCs w:val="26"/>
           </w:rPr>
-          <w:t xml:space="preserve">- Thành phần, biểu mẫu hồ sơ thanh toán; trình tự, thời hạn xem xét, xác nhận hồ sơ áp dụng tương ứng (back-to-back) với Hợp đồng thầu chính. Bên A xác nhận hồ sơ của Bên B sau khi Tư vấn giám sát, Chủ đầu tư xác nhận phần việc tương ứng.</w:t>
+          <w:t xml:space="preserve">- Bên A xem xét, xác nhận hồ sơ khối lượng trong </w:t>
+        </w:r>
+        <w:r>
+          <w:rPr>
+            <w:rFonts w:ascii="Times New Roman" w:hAnsi="Times New Roman"/>
+            <w:sz w:val="26"/>
+            <w:szCs w:val="26"/>
+            <w:highlight w:val="yellow"/>
+          </w:rPr>
+          <w:t xml:space="preserve">……</w:t>
+        </w:r>
+        <w:r>
+          <w:rPr>
+            <w:rFonts w:ascii="Times New Roman" w:hAnsi="Times New Roman"/>
+            <w:sz w:val="26"/>
+            <w:szCs w:val="26"/>
+          </w:rPr>
+          <w:t xml:space="preserve"> ngày làm việc và giá trị thanh toán trong </w:t>
+        </w:r>
+        <w:r>
+          <w:rPr>
+            <w:rFonts w:ascii="Times New Roman" w:hAnsi="Times New Roman"/>
+            <w:sz w:val="26"/>
+            <w:szCs w:val="26"/>
+            <w:highlight w:val="yellow"/>
+          </w:rPr>
+          <w:t xml:space="preserve">……</w:t>
+        </w:r>
+        <w:r>
+          <w:rPr>
+            <w:rFonts w:ascii="Times New Roman" w:hAnsi="Times New Roman"/>
+            <w:sz w:val="26"/>
+            <w:szCs w:val="26"/>
+          </w:rPr>
+          <w:t xml:space="preserve"> ngày làm việc kể từ ngày nhận đủ hồ sơ hợp lệ. Khối lượng đề nghị thanh toán phải được Tư vấn giám sát, Chủ đầu tư xác nhận.</w:t>
         </w:r>
       </w:ins>
     </w:p>
@@ -9447,13 +9697,13 @@
         <w:spacing w:after="120" w:line="276" w:lineRule="auto"/>
         <w:jc w:val="both"/>
         <w:rPr>
-          <w:del w:id="9078" w:author="VNCN E&amp;C" w:date="2026-10-06T08:00:00Z"/>
-          <w:rFonts w:ascii="Times New Roman" w:hAnsi="Times New Roman"/>
-          <w:sz w:val="26"/>
-          <w:szCs w:val="26"/>
-        </w:rPr>
-      </w:pPr>
-      <w:del w:id="9077" w:author="VNCN E&amp;C" w:date="2026-10-06T08:00:00Z">
+          <w:del w:id="9085" w:author="VNCN E&amp;C" w:date="2026-10-06T08:00:00Z"/>
+          <w:rFonts w:ascii="Times New Roman" w:hAnsi="Times New Roman"/>
+          <w:sz w:val="26"/>
+          <w:szCs w:val="26"/>
+        </w:rPr>
+      </w:pPr>
+      <w:del w:id="9084" w:author="VNCN E&amp;C" w:date="2026-10-06T08:00:00Z">
         <w:r>
           <w:rPr>
             <w:rFonts w:ascii="Times New Roman" w:hAnsi="Times New Roman"/>
@@ -10059,7 +10309,7 @@
           <w:szCs w:val="26"/>
         </w:rPr>
       </w:pPr>
-      <w:del w:id="9079" w:author="VNCN E&amp;C" w:date="2026-10-06T08:00:00Z">
+      <w:del w:id="9086" w:author="VNCN E&amp;C" w:date="2026-10-06T08:00:00Z">
         <w:r>
           <w:rPr>
             <w:rFonts w:ascii="Times New Roman" w:hAnsi="Times New Roman"/>
@@ -10069,14 +10319,31 @@
           <w:delText xml:space="preserve">Trong thời hạn 30 ngày kể từ ngày nhận đủ hồ sơ quyết toán hợp lệ, Bên A xem xét, xác nhận giá trị quyết toán.</w:delText>
         </w:r>
       </w:del>
-      <w:ins w:id="9080" w:author="VNCN E&amp;C" w:date="2026-10-06T08:00:00Z">
+      <w:ins w:id="9087" w:author="VNCN E&amp;C" w:date="2026-10-06T08:00:00Z">
         <w:r>
           <w:rPr>
             <w:rFonts w:ascii="Times New Roman" w:hAnsi="Times New Roman"/>
             <w:sz w:val="26"/>
             <w:szCs w:val="26"/>
           </w:rPr>
-          <w:t xml:space="preserve">Trình tự, thời hạn xem xét, xác nhận quyết toán áp dụng tương ứng (back-to-back) với Hợp đồng thầu chính; khối lượng quyết toán của Bên B không vượt quá khối lượng Chủ đầu tư nghiệm thu, quyết toán cho Bên A đối với phần việc tương ứng.</w:t>
+          <w:t xml:space="preserve">Trong thời hạn </w:t>
+        </w:r>
+        <w:r>
+          <w:rPr>
+            <w:rFonts w:ascii="Times New Roman" w:hAnsi="Times New Roman"/>
+            <w:sz w:val="26"/>
+            <w:szCs w:val="26"/>
+            <w:highlight w:val="yellow"/>
+          </w:rPr>
+          <w:t xml:space="preserve">……</w:t>
+        </w:r>
+        <w:r>
+          <w:rPr>
+            <w:rFonts w:ascii="Times New Roman" w:hAnsi="Times New Roman"/>
+            <w:sz w:val="26"/>
+            <w:szCs w:val="26"/>
+          </w:rPr>
+          <w:t xml:space="preserve"> ngày kể từ ngày nhận đủ hồ sơ quyết toán hợp lệ, Bên A xem xét, xác nhận giá trị quyết toán; khối lượng quyết toán không vượt quá khối lượng được Chủ đầu tư, Tư vấn giám sát nghiệm thu đối với phần việc tương ứng.</w:t>
         </w:r>
       </w:ins>
       <w:r>
@@ -10331,7 +10598,35 @@
           <w:sz w:val="26"/>
           <w:szCs w:val="26"/>
         </w:rPr>
-        <w:t xml:space="preserve">- Là khối lượng được tính theo kích thước hình học của bản vẽ thiết kế kỹ thuật thi công được Bên A, Tư vấn giám sát phê duyệt và không vượt quá khối lượng tương ứng được Chủ đầu tư nghiệm thu, thanh toán cho Bên A;</w:t>
+        <w:t xml:space="preserve">- Là khối lượng được tính theo kích thước hình học của bản vẽ thiết kế kỹ thuật thi công được Bên A, Tư vấn giám sát phê duyệt và không vượt quá khối lượng </w:t>
+      </w:r>
+      <w:del w:id="9157" w:author="VNCN E&amp;C" w:date="2026-10-06T08:00:00Z">
+        <w:r>
+          <w:rPr>
+            <w:rFonts w:ascii="Times New Roman" w:hAnsi="Times New Roman"/>
+            <w:sz w:val="26"/>
+            <w:szCs w:val="26"/>
+          </w:rPr>
+          <w:delText xml:space="preserve">tương ứng được Chủ đầu tư nghiệm thu, thanh toán cho Bên A</w:delText>
+        </w:r>
+      </w:del>
+      <w:ins w:id="9158" w:author="VNCN E&amp;C" w:date="2026-10-06T08:00:00Z">
+        <w:r>
+          <w:rPr>
+            <w:rFonts w:ascii="Times New Roman" w:hAnsi="Times New Roman"/>
+            <w:sz w:val="26"/>
+            <w:szCs w:val="26"/>
+          </w:rPr>
+          <w:t xml:space="preserve">tương ứng được Chủ đầu tư, Tư vấn giám sát nghiệm thu</w:t>
+        </w:r>
+      </w:ins>
+      <w:r>
+        <w:rPr>
+          <w:rFonts w:ascii="Times New Roman" w:hAnsi="Times New Roman"/>
+          <w:sz w:val="26"/>
+          <w:szCs w:val="26"/>
+        </w:rPr>
+        <w:t xml:space="preserve">;</w:t>
       </w:r>
     </w:p>
     <w:p>
@@ -10398,7 +10693,7 @@
         </w:rPr>
         <w:t xml:space="preserve">Thời hạn thanh toán các khoản tạm ứng, thanh toán đợt, thanh toán sau khi hoàn thành sẽ </w:t>
       </w:r>
-      <w:del w:id="9081" w:author="VNCN E&amp;C" w:date="2026-10-06T08:00:00Z">
+      <w:del w:id="9088" w:author="VNCN E&amp;C" w:date="2026-10-06T08:00:00Z">
         <w:r>
           <w:rPr>
             <w:rFonts w:ascii="Times New Roman" w:hAnsi="Times New Roman"/>
@@ -10408,7 +10703,7 @@
           <w:delText xml:space="preserve">trong vòng 15 ngày làm việc</w:delText>
         </w:r>
       </w:del>
-      <w:ins w:id="9082" w:author="VNCN E&amp;C" w:date="2026-10-06T08:00:00Z">
+      <w:ins w:id="9089" w:author="VNCN E&amp;C" w:date="2026-10-06T08:00:00Z">
         <w:r>
           <w:rPr>
             <w:rFonts w:ascii="Times New Roman" w:hAnsi="Times New Roman"/>
@@ -10437,27 +10732,47 @@
           <w:szCs w:val="26"/>
         </w:rPr>
       </w:pPr>
-      <w:r>
-        <w:rPr>
-          <w:rFonts w:ascii="Times New Roman" w:hAnsi="Times New Roman"/>
-          <w:sz w:val="26"/>
-          <w:szCs w:val="26"/>
-        </w:rPr>
-        <w:t>Trường hợp Chủ đầu tư chậm thanh toán cho Bên A đối với phần công việc tương ứng, thời hạn thanh toán cho Bên B được lùi tương ứng với thời gian Chủ đầu tư chậm thanh toán; Bên A không bị coi là vi phạm nghĩa vụ thanh toán và không phải chịu lãi chậm trả trong trường hợp này.</w:t>
-      </w:r>
-    </w:p>
-    <w:p>
-      <w:pPr>
-        <w:spacing w:after="120" w:line="276" w:lineRule="auto"/>
-        <w:jc w:val="both"/>
-        <w:rPr>
-          <w:ins w:id="9083" w:author="VNCN E&amp;C" w:date="2026-10-06T08:00:00Z"/>
-          <w:rFonts w:ascii="Times New Roman" w:hAnsi="Times New Roman"/>
-          <w:sz w:val="26"/>
-          <w:szCs w:val="26"/>
-        </w:rPr>
-      </w:pPr>
-      <w:ins w:id="9084" w:author="VNCN E&amp;C" w:date="2026-10-06T08:00:00Z">
+      <w:del w:id="9090" w:author="VNCN E&amp;C" w:date="2026-10-06T08:00:00Z">
+        <w:r>
+          <w:rPr>
+            <w:rFonts w:ascii="Times New Roman" w:hAnsi="Times New Roman"/>
+            <w:sz w:val="26"/>
+            <w:szCs w:val="26"/>
+          </w:rPr>
+          <w:delText xml:space="preserve">Trường hợp Chủ đầu tư chậm thanh toán cho Bên A đối với phần công việc tương ứng, thời hạn thanh toán cho Bên B được lùi tương ứng với thời gian Chủ đầu tư chậm thanh toán</w:delText>
+        </w:r>
+      </w:del>
+      <w:ins w:id="9091" w:author="VNCN E&amp;C" w:date="2026-10-06T08:00:00Z">
+        <w:r>
+          <w:rPr>
+            <w:rFonts w:ascii="Times New Roman" w:hAnsi="Times New Roman"/>
+            <w:sz w:val="26"/>
+            <w:szCs w:val="26"/>
+          </w:rPr>
+          <w:t xml:space="preserve">Trường hợp nguồn vốn thanh toán của Dự án cho phần công việc tương ứng chưa được Chủ đầu tư giải ngân, thời hạn thanh toán cho Bên B được lùi tương ứng với thời gian chậm giải ngân</w:t>
+        </w:r>
+      </w:ins>
+      <w:r>
+        <w:rPr>
+          <w:rFonts w:ascii="Times New Roman" w:hAnsi="Times New Roman"/>
+          <w:sz w:val="26"/>
+          <w:szCs w:val="26"/>
+        </w:rPr>
+        <w:t xml:space="preserve">; Bên A không bị coi là vi phạm nghĩa vụ thanh toán và không phải chịu lãi chậm trả trong trường hợp này.</w:t>
+      </w:r>
+    </w:p>
+    <w:p>
+      <w:pPr>
+        <w:spacing w:after="120" w:line="276" w:lineRule="auto"/>
+        <w:jc w:val="both"/>
+        <w:rPr>
+          <w:ins w:id="9092" w:author="VNCN E&amp;C" w:date="2026-10-06T08:00:00Z"/>
+          <w:rFonts w:ascii="Times New Roman" w:hAnsi="Times New Roman"/>
+          <w:sz w:val="26"/>
+          <w:szCs w:val="26"/>
+        </w:rPr>
+      </w:pPr>
+      <w:ins w:id="9093" w:author="VNCN E&amp;C" w:date="2026-10-06T08:00:00Z">
         <w:r>
           <w:rPr>
             <w:rFonts w:ascii="Times New Roman" w:hAnsi="Times New Roman"/>
@@ -11089,7 +11404,27 @@
           <w:szCs w:val="26"/>
           <w:lang w:val="vi-VN"/>
         </w:rPr>
-        <w:t>Bên A có quyền yêu cầu tất cả thiết bị, trang bị bảo hộ lao động của Bên B huy động đến Công trường phải treo, mang logo tên của Nhà thầu chính Bên A trong suốt quá trình làm việc trên Công trường.</w:t>
+        <w:t xml:space="preserve">Bên A có quyền yêu cầu tất cả thiết bị, trang bị bảo hộ lao động của Bên B huy động đến Công trường phải treo, mang logo tên của </w:t>
+      </w:r>
+      <w:del w:id="9159" w:author="VNCN E&amp;C" w:date="2026-10-06T08:00:00Z">
+        <w:r>
+          <w:rPr>
+            <w:rFonts w:ascii="Times New Roman" w:hAnsi="Times New Roman"/>
+            <w:sz w:val="26"/>
+            <w:szCs w:val="26"/>
+            <w:lang w:val="vi-VN"/>
+          </w:rPr>
+          <w:delText xml:space="preserve">Nhà thầu chính </w:delText>
+        </w:r>
+      </w:del>
+      <w:r>
+        <w:rPr>
+          <w:rFonts w:ascii="Times New Roman" w:hAnsi="Times New Roman"/>
+          <w:sz w:val="26"/>
+          <w:szCs w:val="26"/>
+          <w:lang w:val="vi-VN"/>
+        </w:rPr>
+        <w:t xml:space="preserve">Bên A trong suốt quá trình làm việc trên Công trường.</w:t>
       </w:r>
     </w:p>
     <w:p>
@@ -11371,7 +11706,7 @@
         </w:rPr>
         <w:t xml:space="preserve">Thanh toán chi phí dừng chờ việc hợp lý cho Bên B chỉ khi việc dừng chờ do lỗi trực tiếp của Bên A, kéo dài liên tục </w:t>
       </w:r>
-      <w:del w:id="9085" w:author="VNCN E&amp;C" w:date="2026-10-06T08:00:00Z">
+      <w:del w:id="9094" w:author="VNCN E&amp;C" w:date="2026-10-06T08:00:00Z">
         <w:r>
           <w:rPr>
             <w:rFonts w:ascii="Times New Roman" w:hAnsi="Times New Roman"/>
@@ -11398,7 +11733,7 @@
           <w:delText xml:space="preserve"> ngày</w:delText>
         </w:r>
       </w:del>
-      <w:ins w:id="9086" w:author="VNCN E&amp;C" w:date="2026-10-06T08:00:00Z">
+      <w:ins w:id="9095" w:author="VNCN E&amp;C" w:date="2026-10-06T08:00:00Z">
         <w:r>
           <w:rPr>
             <w:rFonts w:ascii="Times New Roman" w:hAnsi="Times New Roman"/>
@@ -11431,8 +11766,28 @@
           <w:sz w:val="26"/>
           <w:szCs w:val="26"/>
         </w:rPr>
-        <w:t xml:space="preserve"> và được hai Bên lập biên bản xác nhận tại hiện trường trong vòng 24 giờ kể từ khi phát sinh. Chi phí được xác định theo số lượng thiết bị, nhân lực thực tế phải dừng chờ, không bao gồm lợi nhuận và chi phí gián tiếp. Bên A không chịu chi phí dừng chờ do nguyên nhân từ Chủ đầu tư, cơ quan nhà nước, bên thứ ba hoặc sự kiện bất khả kháng, trừ phần Bên A được Chủ đầu tư bù đắp tương ứng.</w:t>
-      </w:r>
+        <w:t xml:space="preserve"> và được hai Bên lập biên bản xác nhận tại hiện trường trong vòng 24 giờ kể từ khi phát sinh. Chi phí được xác định theo số lượng thiết bị, nhân lực thực tế phải dừng chờ, không bao gồm lợi nhuận và chi phí gián tiếp. Bên A không chịu chi phí dừng chờ do nguyên nhân từ Chủ đầu tư, cơ quan nhà nước, bên thứ ba hoặc sự kiện bất khả kháng</w:t>
+      </w:r>
+      <w:del w:id="9161" w:author="VNCN E&amp;C" w:date="2026-10-06T08:00:00Z">
+        <w:r>
+          <w:rPr>
+            <w:rFonts w:ascii="Times New Roman" w:hAnsi="Times New Roman"/>
+            <w:sz w:val="26"/>
+            <w:szCs w:val="26"/>
+          </w:rPr>
+          <w:delText xml:space="preserve">, trừ phần Bên A được Chủ đầu tư bù đắp tương ứng.</w:delText>
+        </w:r>
+      </w:del>
+      <w:ins w:id="9162" w:author="VNCN E&amp;C" w:date="2026-10-06T08:00:00Z">
+        <w:r>
+          <w:rPr>
+            <w:rFonts w:ascii="Times New Roman" w:hAnsi="Times New Roman"/>
+            <w:sz w:val="26"/>
+            <w:szCs w:val="26"/>
+          </w:rPr>
+          <w:t xml:space="preserve">.</w:t>
+        </w:r>
+      </w:ins>
     </w:p>
     <w:p>
       <w:pPr>
@@ -12274,7 +12629,38 @@
           <w:szCs w:val="26"/>
           <w:lang w:val="fr-FR"/>
         </w:rPr>
-        <w:t>a) Bên B phải tuân thủ tất cả quy định an toàn lao động hiện hành, quy định của Hợp đồng thầu chính, yêu cầu của Chủ đầu tư, Tư vấn giám sát và Bên A; chịu trách nhiệm về an toàn cho tất cả những người, tài sản có mặt trên Công trường; có biện pháp nhằm đảm bảo an toàn cho Hạng mục công trình, công trình lân cận, tài sản và cho những người có mặt trên Công trường.</w:t>
+        <w:t xml:space="preserve">a) Bên B phải tuân thủ tất cả quy định an toàn lao động hiện hành, </w:t>
+      </w:r>
+      <w:del w:id="9163" w:author="VNCN E&amp;C" w:date="2026-10-06T08:00:00Z">
+        <w:r>
+          <w:rPr>
+            <w:rFonts w:ascii="Times New Roman" w:hAnsi="Times New Roman"/>
+            <w:sz w:val="26"/>
+            <w:szCs w:val="26"/>
+            <w:lang w:val="fr-FR"/>
+          </w:rPr>
+          <w:delText xml:space="preserve">quy định của Hợp đồng thầu chính</w:delText>
+        </w:r>
+      </w:del>
+      <w:ins w:id="9164" w:author="VNCN E&amp;C" w:date="2026-10-06T08:00:00Z">
+        <w:r>
+          <w:rPr>
+            <w:rFonts w:ascii="Times New Roman" w:hAnsi="Times New Roman"/>
+            <w:sz w:val="26"/>
+            <w:szCs w:val="26"/>
+            <w:lang w:val="fr-FR"/>
+          </w:rPr>
+          <w:t xml:space="preserve">quy định của Dự án</w:t>
+        </w:r>
+      </w:ins>
+      <w:r>
+        <w:rPr>
+          <w:rFonts w:ascii="Times New Roman" w:hAnsi="Times New Roman"/>
+          <w:sz w:val="26"/>
+          <w:szCs w:val="26"/>
+          <w:lang w:val="fr-FR"/>
+        </w:rPr>
+        <w:t xml:space="preserve">, yêu cầu của Chủ đầu tư, Tư vấn giám sát và Bên A; chịu trách nhiệm về an toàn cho tất cả những người, tài sản có mặt trên Công trường; có biện pháp nhằm đảm bảo an toàn cho Hạng mục công trình, công trình lân cận, tài sản và cho những người có mặt trên Công trường.</w:t>
       </w:r>
     </w:p>
     <w:p>
@@ -13184,7 +13570,27 @@
           <w:szCs w:val="26"/>
           <w:lang w:val="fr-FR"/>
         </w:rPr>
-        <w:t>Bên B có trách nhiệm đáp ứng yêu cầu của Bên A về việc tất cả thiết bị, trang bị bảo hộ lao động của Bên B huy động đến Công trường phải treo, mang logo tên của Nhà thầu chính Bên A trong suốt quá trình làm việc trên Công trường.</w:t>
+        <w:t xml:space="preserve">Bên B có trách nhiệm đáp ứng yêu cầu của Bên A về việc tất cả thiết bị, trang bị bảo hộ lao động của Bên B huy động đến Công trường phải treo, mang logo tên của </w:t>
+      </w:r>
+      <w:del w:id="9160" w:author="VNCN E&amp;C" w:date="2026-10-06T08:00:00Z">
+        <w:r>
+          <w:rPr>
+            <w:rFonts w:ascii="Times New Roman" w:hAnsi="Times New Roman"/>
+            <w:sz w:val="26"/>
+            <w:szCs w:val="26"/>
+            <w:lang w:val="fr-FR"/>
+          </w:rPr>
+          <w:delText xml:space="preserve">Nhà thầu chính </w:delText>
+        </w:r>
+      </w:del>
+      <w:r>
+        <w:rPr>
+          <w:rFonts w:ascii="Times New Roman" w:hAnsi="Times New Roman"/>
+          <w:sz w:val="26"/>
+          <w:szCs w:val="26"/>
+          <w:lang w:val="fr-FR"/>
+        </w:rPr>
+        <w:t xml:space="preserve">Bên A trong suốt quá trình làm việc trên Công trường.</w:t>
       </w:r>
     </w:p>
     <w:p>
@@ -13683,7 +14089,7 @@
         </w:rPr>
         <w:t xml:space="preserve">Bên B có trách nhiệm lập hồ sơ cho khối lượng công việc phát sinh và nộp cho Bên A hồ sơ bao gồm: </w:t>
       </w:r>
-      <w:del w:id="9087" w:author="VNCN E&amp;C" w:date="2026-10-06T08:00:00Z">
+      <w:del w:id="9096" w:author="VNCN E&amp;C" w:date="2026-10-06T08:00:00Z">
         <w:r>
           <w:rPr>
             <w:rFonts w:ascii="Times New Roman" w:hAnsi="Times New Roman"/>
@@ -13693,7 +14099,7 @@
           <w:delText xml:space="preserve">biện pháp thi công, đơn giá thi công theo nguyên tắc:</w:delText>
         </w:r>
       </w:del>
-      <w:ins w:id="9088" w:author="VNCN E&amp;C" w:date="2026-10-06T08:00:00Z">
+      <w:ins w:id="9097" w:author="VNCN E&amp;C" w:date="2026-10-06T08:00:00Z">
         <w:r>
           <w:rPr>
             <w:rFonts w:ascii="Times New Roman" w:hAnsi="Times New Roman"/>
@@ -13753,7 +14159,35 @@
           <w:sz w:val="26"/>
           <w:szCs w:val="26"/>
         </w:rPr>
-        <w:t>(ii) Trường hợp khối lượng công việc phát sinh, thay đổi chưa có đơn giá trong Hợp đồng hoặc đã có đơn giá trong Hợp đồng nhưng phải điều chỉnh theo quy định của Hợp đồng, thì đơn giá do hai Bên thỏa thuận trước khi thực hiện, trên nguyên tắc không vượt quá đơn giá được Chủ đầu tư phê duyệt cho Bên A đối với công việc tương ứng.</w:t>
+        <w:t xml:space="preserve">(ii) Trường hợp khối lượng công việc phát sinh, thay đổi chưa có đơn giá trong Hợp đồng hoặc đã có đơn giá trong Hợp đồng nhưng phải điều chỉnh theo quy định của Hợp đồng, thì đơn giá do hai Bên thỏa thuận trước khi thực hiện, </w:t>
+      </w:r>
+      <w:del w:id="9165" w:author="VNCN E&amp;C" w:date="2026-10-06T08:00:00Z">
+        <w:r>
+          <w:rPr>
+            <w:rFonts w:ascii="Times New Roman" w:hAnsi="Times New Roman"/>
+            <w:sz w:val="26"/>
+            <w:szCs w:val="26"/>
+          </w:rPr>
+          <w:delText xml:space="preserve">trên nguyên tắc không vượt quá đơn giá được Chủ đầu tư phê duyệt cho Bên A đối với công việc tương ứng</w:delText>
+        </w:r>
+      </w:del>
+      <w:ins w:id="9166" w:author="VNCN E&amp;C" w:date="2026-10-06T08:00:00Z">
+        <w:r>
+          <w:rPr>
+            <w:rFonts w:ascii="Times New Roman" w:hAnsi="Times New Roman"/>
+            <w:sz w:val="26"/>
+            <w:szCs w:val="26"/>
+          </w:rPr>
+          <w:t xml:space="preserve">trên cơ sở định mức, đơn giá do cơ quan nhà nước có thẩm quyền công bố và mặt bằng đơn giá của Hợp đồng</w:t>
+        </w:r>
+      </w:ins>
+      <w:r>
+        <w:rPr>
+          <w:rFonts w:ascii="Times New Roman" w:hAnsi="Times New Roman"/>
+          <w:sz w:val="26"/>
+          <w:szCs w:val="26"/>
+        </w:rPr>
+        <w:t xml:space="preserve">.</w:t>
       </w:r>
     </w:p>
     <w:p>
@@ -13875,7 +14309,7 @@
         </w:rPr>
         <w:t>Sau khi hồ sơ cho khối lượng phát sinh được Bên A chấp thuận, hai Bên sẽ ký phụ lục bổ sung Hợp đồng hoặc văn bản xác nhận khối lượng/đơn giá có chữ ký của người đại diện có thẩm quyền của hai Bên để làm cơ sở thanh toán. Trừ trường hợp khẩn cấp quy định tại Điều 13.1, Bên A không có nghĩa vụ thanh toán đối với các công việc phát sinh, thay đổi không có chấp thuận bằng văn bản của người đại diện có thẩm quyền của Bên A.</w:t>
       </w:r>
-      <w:ins w:id="9089" w:author="VNCN E&amp;C" w:date="2026-10-06T08:00:00Z">
+      <w:ins w:id="9098" w:author="VNCN E&amp;C" w:date="2026-10-06T08:00:00Z">
         <w:r>
           <w:rPr>
             <w:rFonts w:ascii="Times New Roman" w:hAnsi="Times New Roman"/>
@@ -13914,7 +14348,7 @@
         </w:rPr>
         <w:t xml:space="preserve">Hai bên cùng đồng ý rằng, chi phí cho các công việc phát sinh, thay đổi sẽ chỉ được Bên A thanh toán cho Bên B </w:t>
       </w:r>
-      <w:del w:id="9090" w:author="VNCN E&amp;C" w:date="2026-10-06T08:00:00Z">
+      <w:del w:id="9099" w:author="VNCN E&amp;C" w:date="2026-10-06T08:00:00Z">
         <w:r>
           <w:rPr>
             <w:rFonts w:ascii="Times New Roman" w:hAnsi="Times New Roman"/>
@@ -13941,7 +14375,7 @@
           <w:delText>hồ sơ thanh toán hợp lệ của Bên B.</w:delText>
         </w:r>
       </w:del>
-      <w:ins w:id="9091" w:author="VNCN E&amp;C" w:date="2026-10-06T08:00:00Z">
+      <w:ins w:id="9100" w:author="VNCN E&amp;C" w:date="2026-10-06T08:00:00Z">
         <w:r>
           <w:rPr>
             <w:rFonts w:ascii="Times New Roman" w:hAnsi="Times New Roman"/>
@@ -14708,7 +15142,41 @@
           <w:szCs w:val="26"/>
           <w:lang w:val="vi-VN"/>
         </w:rPr>
-        <w:t>b) Trường hợp Chủ đầu tư yêu cầu rút ngắn hoặc cho phép kéo dài thời gian hoàn thành Hạng mục công trình, Bên A sẽ thông báo bằng văn bản cho Bên B để Bên B thực hiện ( trừ trường hợp do lỗi của Bên B). Chi phí phát sinh (nếu có) chỉ được xem xét trong phạm vi Chủ đầu tư chấp thuận thanh toán tương ứng cho Bên A và phải được Bên A phê duyệt bằng văn bản trước khi thực hiện.</w:t>
+        <w:t xml:space="preserve">b) Trường hợp Chủ đầu tư yêu cầu rút ngắn hoặc cho phép kéo dài thời gian hoàn thành Hạng mục công trình, Bên A sẽ thông báo bằng văn bản cho Bên B để Bên B thực hiện ( trừ trường hợp do lỗi của Bên B). Chi phí phát sinh (nếu có) </w:t>
+      </w:r>
+      <w:del w:id="9167" w:author="VNCN E&amp;C" w:date="2026-10-06T08:00:00Z">
+        <w:r>
+          <w:rPr>
+            <w:rFonts w:ascii="Times New Roman" w:hAnsi="Times New Roman"/>
+            <w:noProof w:val="0"/>
+            <w:sz w:val="26"/>
+            <w:szCs w:val="26"/>
+            <w:lang w:val="vi-VN"/>
+          </w:rPr>
+          <w:delText xml:space="preserve">chỉ được xem xét trong phạm vi Chủ đầu tư chấp thuận thanh toán tương ứng cho Bên A và phải được</w:delText>
+        </w:r>
+      </w:del>
+      <w:ins w:id="9168" w:author="VNCN E&amp;C" w:date="2026-10-06T08:00:00Z">
+        <w:r>
+          <w:rPr>
+            <w:rFonts w:ascii="Times New Roman" w:hAnsi="Times New Roman"/>
+            <w:noProof w:val="0"/>
+            <w:sz w:val="26"/>
+            <w:szCs w:val="26"/>
+            <w:lang w:val="vi-VN"/>
+          </w:rPr>
+          <w:t xml:space="preserve">chỉ được xem xét khi được</w:t>
+        </w:r>
+      </w:ins>
+      <w:r>
+        <w:rPr>
+          <w:rFonts w:ascii="Times New Roman" w:hAnsi="Times New Roman"/>
+          <w:noProof w:val="0"/>
+          <w:sz w:val="26"/>
+          <w:szCs w:val="26"/>
+          <w:lang w:val="vi-VN"/>
+        </w:rPr>
+        <w:t xml:space="preserve"> Bên A phê duyệt bằng văn bản trước khi thực hiện.</w:t>
       </w:r>
     </w:p>
     <w:p>
@@ -14792,6 +15260,30 @@
         </w:rPr>
         <w:t xml:space="preserve"> </w:t>
       </w:r>
+      <w:del w:id="9169" w:author="VNCN E&amp;C" w:date="2026-10-06T08:00:00Z">
+        <w:r>
+          <w:rPr>
+            <w:rFonts w:ascii="Times New Roman" w:hAnsi="Times New Roman"/>
+            <w:noProof w:val="0"/>
+            <w:sz w:val="26"/>
+            <w:szCs w:val="26"/>
+            <w:lang w:val="vi-VN"/>
+          </w:rPr>
+          <w:delText xml:space="preserve">chấp thuận nghiệm thu cho Bên A</w:delText>
+        </w:r>
+      </w:del>
+      <w:ins w:id="9170" w:author="VNCN E&amp;C" w:date="2026-10-06T08:00:00Z">
+        <w:r>
+          <w:rPr>
+            <w:rFonts w:ascii="Times New Roman" w:hAnsi="Times New Roman"/>
+            <w:noProof w:val="0"/>
+            <w:sz w:val="26"/>
+            <w:szCs w:val="26"/>
+            <w:lang w:val="vi-VN"/>
+          </w:rPr>
+          <w:t xml:space="preserve">chấp thuận nghiệm thu</w:t>
+        </w:r>
+      </w:ins>
       <w:r>
         <w:rPr>
           <w:rFonts w:ascii="Times New Roman" w:hAnsi="Times New Roman"/>
@@ -14800,7 +15292,7 @@
           <w:szCs w:val="26"/>
           <w:lang w:val="vi-VN"/>
         </w:rPr>
-        <w:t>chấp thuận nghiệm thu cho Bên A và được Bên A xác nhận.</w:t>
+        <w:t xml:space="preserve"> và được Bên A xác nhận.</w:t>
       </w:r>
     </w:p>
     <w:p>
@@ -15109,7 +15601,41 @@
           <w:szCs w:val="26"/>
           <w:lang w:val="vi-VN"/>
         </w:rPr>
-        <w:t xml:space="preserve"> Khi xảy ra sự kiện bất khả kháng, Bên B chỉ được gia hạn thời gian tương ứng với thời gian bị ảnh hưởng trực tiếp và không vượt quá thời gian Bên A được Chủ đầu tư gia hạn; Bên B tự chịu các chi phí, thiệt hại của mình do sự kiện bất khả kháng gây ra.</w:t>
+        <w:t xml:space="preserve"> Khi xảy ra sự kiện bất khả kháng, Bên B chỉ được gia hạn thời gian tương ứng với thời gian bị ảnh hưởng trực tiếp và không vượt quá </w:t>
+      </w:r>
+      <w:del w:id="9171" w:author="VNCN E&amp;C" w:date="2026-10-06T08:00:00Z">
+        <w:r>
+          <w:rPr>
+            <w:rFonts w:ascii="Times New Roman" w:hAnsi="Times New Roman"/>
+            <w:noProof w:val="0"/>
+            <w:sz w:val="26"/>
+            <w:szCs w:val="26"/>
+            <w:lang w:val="vi-VN"/>
+          </w:rPr>
+          <w:delText xml:space="preserve">thời gian Bên A được Chủ đầu tư gia hạn</w:delText>
+        </w:r>
+      </w:del>
+      <w:ins w:id="9172" w:author="VNCN E&amp;C" w:date="2026-10-06T08:00:00Z">
+        <w:r>
+          <w:rPr>
+            <w:rFonts w:ascii="Times New Roman" w:hAnsi="Times New Roman"/>
+            <w:noProof w:val="0"/>
+            <w:sz w:val="26"/>
+            <w:szCs w:val="26"/>
+            <w:lang w:val="vi-VN"/>
+          </w:rPr>
+          <w:t xml:space="preserve">thời gian gia hạn chung của Dự án được Chủ đầu tư chấp thuận</w:t>
+        </w:r>
+      </w:ins>
+      <w:r>
+        <w:rPr>
+          <w:rFonts w:ascii="Times New Roman" w:hAnsi="Times New Roman"/>
+          <w:noProof w:val="0"/>
+          <w:sz w:val="26"/>
+          <w:szCs w:val="26"/>
+          <w:lang w:val="vi-VN"/>
+        </w:rPr>
+        <w:t xml:space="preserve">; Bên B tự chịu các chi phí, thiệt hại của mình do sự kiện bất khả kháng gây ra.</w:t>
       </w:r>
     </w:p>
     <w:p>
@@ -15232,8 +15758,30 @@
           <w:szCs w:val="26"/>
           <w:lang w:val="vi-VN"/>
         </w:rPr>
-        <w:t>(ii) Trường hợp chưa có thiết kế, mặt bằng để thi công, thay đổi thiết kế; Chủ đầu tư yêu cầu dừng thi công, người dân và/hoặc chính quyền ngăn cản thi công nhưng không do lỗi của Bên A hoặc của Bên B, thì Bên B có thể sẽ tạm ngừng thực hiện công việc của Hợp đồng bị ảnh hưởng bởi các sự kiện này. Trong trường hợp này, Bên B được xem xét gia hạn thời gian thực hiện tương ứng; chi phí phát sinh (nếu có) chỉ được xem xét trong phạm vi Bên A được Chủ đầu tư chấp thuận bù đắp.</w:t>
-      </w:r>
+        <w:t xml:space="preserve">(ii) Trường hợp chưa có thiết kế, mặt bằng để thi công, thay đổi thiết kế; Chủ đầu tư yêu cầu dừng thi công, người dân và/hoặc chính quyền ngăn cản thi công nhưng không do lỗi của Bên A hoặc của Bên B, thì Bên B có thể sẽ tạm ngừng thực hiện công việc của Hợp đồng bị ảnh hưởng bởi các sự kiện này. Trong trường hợp này, Bên B được xem xét gia hạn thời gian thực hiện tương ứng; </w:t>
+      </w:r>
+      <w:del w:id="9173" w:author="VNCN E&amp;C" w:date="2026-10-06T08:00:00Z">
+        <w:r>
+          <w:rPr>
+            <w:rFonts w:ascii="Times New Roman" w:hAnsi="Times New Roman"/>
+            <w:sz w:val="26"/>
+            <w:szCs w:val="26"/>
+            <w:lang w:val="vi-VN"/>
+          </w:rPr>
+          <w:delText xml:space="preserve">chi phí phát sinh (nếu có) chỉ được xem xét trong phạm vi Bên A được Chủ đầu tư chấp thuận bù đắp.</w:delText>
+        </w:r>
+      </w:del>
+      <w:ins w:id="9174" w:author="VNCN E&amp;C" w:date="2026-10-06T08:00:00Z">
+        <w:r>
+          <w:rPr>
+            <w:rFonts w:ascii="Times New Roman" w:hAnsi="Times New Roman"/>
+            <w:sz w:val="26"/>
+            <w:szCs w:val="26"/>
+            <w:lang w:val="vi-VN"/>
+          </w:rPr>
+          <w:t xml:space="preserve">Bên A không có nghĩa vụ thanh toán chi phí phát sinh, trừ trường hợp hai Bên có thỏa thuận khác bằng văn bản.</w:t>
+        </w:r>
+      </w:ins>
     </w:p>
     <w:p>
       <w:pPr>
@@ -15294,7 +15842,7 @@
         <w:spacing w:after="120" w:line="276" w:lineRule="auto"/>
         <w:jc w:val="both"/>
         <w:rPr>
-          <w:ins w:id="9092" w:author="VNCN E&amp;C" w:date="2026-10-06T08:00:00Z"/>
+          <w:ins w:id="9101" w:author="VNCN E&amp;C" w:date="2026-10-06T08:00:00Z"/>
           <w:rFonts w:ascii="Times New Roman" w:hAnsi="Times New Roman"/>
           <w:bCs/>
           <w:sz w:val="26"/>
@@ -15302,7 +15850,7 @@
           <w:lang w:val="vi-VN"/>
         </w:rPr>
       </w:pPr>
-      <w:ins w:id="9093" w:author="VNCN E&amp;C" w:date="2026-10-06T08:00:00Z">
+      <w:ins w:id="9102" w:author="VNCN E&amp;C" w:date="2026-10-06T08:00:00Z">
         <w:r>
           <w:rPr>
             <w:rFonts w:ascii="Times New Roman" w:hAnsi="Times New Roman"/>
@@ -15453,7 +16001,38 @@
           <w:szCs w:val="26"/>
           <w:lang w:val="vi-VN"/>
         </w:rPr>
-        <w:t>(iv) Hợp đồng thầu chính bị chấm dứt trước thời hạn. Trong trường hợp này, Bên A chỉ thanh toán giá trị khối lượng đã được nghiệm thu, không phải chịu phạt hay bồi thường cho Bên B.</w:t>
+        <w:t xml:space="preserve">(iv) </w:t>
+      </w:r>
+      <w:del w:id="9175" w:author="VNCN E&amp;C" w:date="2026-10-06T08:00:00Z">
+        <w:r>
+          <w:rPr>
+            <w:rFonts w:ascii="Times New Roman" w:hAnsi="Times New Roman"/>
+            <w:sz w:val="26"/>
+            <w:szCs w:val="26"/>
+            <w:lang w:val="vi-VN"/>
+          </w:rPr>
+          <w:delText xml:space="preserve">Hợp đồng thầu chính bị chấm dứt trước thời hạn</w:delText>
+        </w:r>
+      </w:del>
+      <w:ins w:id="9176" w:author="VNCN E&amp;C" w:date="2026-10-06T08:00:00Z">
+        <w:r>
+          <w:rPr>
+            <w:rFonts w:ascii="Times New Roman" w:hAnsi="Times New Roman"/>
+            <w:sz w:val="26"/>
+            <w:szCs w:val="26"/>
+            <w:lang w:val="vi-VN"/>
+          </w:rPr>
+          <w:t xml:space="preserve">Dự án hoặc phần công việc liên quan bị dừng, đình chỉ hoặc chấm dứt thực hiện theo quyết định của Chủ đầu tư hoặc cơ quan nhà nước có thẩm quyền</w:t>
+        </w:r>
+      </w:ins>
+      <w:r>
+        <w:rPr>
+          <w:rFonts w:ascii="Times New Roman" w:hAnsi="Times New Roman"/>
+          <w:sz w:val="26"/>
+          <w:szCs w:val="26"/>
+          <w:lang w:val="vi-VN"/>
+        </w:rPr>
+        <w:t xml:space="preserve">. Trong trường hợp này, Bên A chỉ thanh toán giá trị khối lượng đã được nghiệm thu, không phải chịu phạt hay bồi thường cho Bên B.</w:t>
       </w:r>
     </w:p>
     <w:p>
@@ -15536,7 +16115,7 @@
         </w:rPr>
         <w:t xml:space="preserve">Bên B dừng thi công </w:t>
       </w:r>
-      <w:del w:id="9094" w:author="VNCN E&amp;C" w:date="2026-10-06T08:00:00Z">
+      <w:del w:id="9103" w:author="VNCN E&amp;C" w:date="2026-10-06T08:00:00Z">
         <w:r>
           <w:rPr>
             <w:rFonts w:ascii="Times New Roman" w:hAnsi="Times New Roman"/>
@@ -15547,7 +16126,7 @@
           <w:delText xml:space="preserve">07 ngày</w:delText>
         </w:r>
       </w:del>
-      <w:ins w:id="9095" w:author="VNCN E&amp;C" w:date="2026-10-06T08:00:00Z">
+      <w:ins w:id="9104" w:author="VNCN E&amp;C" w:date="2026-10-06T08:00:00Z">
         <w:r>
           <w:rPr>
             <w:rFonts w:ascii="Times New Roman" w:hAnsi="Times New Roman"/>
@@ -15597,7 +16176,7 @@
         </w:rPr>
         <w:t xml:space="preserve">Các công việc của Hợp đồng bị chậm so với tiến độ được chấp thuận </w:t>
       </w:r>
-      <w:del w:id="9096" w:author="VNCN E&amp;C" w:date="2026-10-06T08:00:00Z">
+      <w:del w:id="9105" w:author="VNCN E&amp;C" w:date="2026-10-06T08:00:00Z">
         <w:r>
           <w:rPr>
             <w:rFonts w:ascii="Times New Roman" w:hAnsi="Times New Roman"/>
@@ -15608,7 +16187,7 @@
           <w:delText xml:space="preserve">quá 14 ngày và nếu Bên B không thực thi các biện pháp rõ ràng và tích cực để bắt kịp tiến độ</w:delText>
         </w:r>
       </w:del>
-      <w:ins w:id="9097" w:author="VNCN E&amp;C" w:date="2026-10-06T08:00:00Z">
+      <w:ins w:id="9106" w:author="VNCN E&amp;C" w:date="2026-10-06T08:00:00Z">
         <w:r>
           <w:rPr>
             <w:rFonts w:ascii="Times New Roman" w:hAnsi="Times New Roman"/>
@@ -15716,7 +16295,38 @@
           <w:szCs w:val="26"/>
           <w:lang w:val="vi-VN"/>
         </w:rPr>
-        <w:t xml:space="preserve">Bên B không tuân theo các hướng dẫn của Bên A, Tư vấn giám sát, Chủ đầu tư hoặc liên tiếp hành động một cách bất hợp tác đối với Bên A, Tư vấn giám sát, Chủ đầu tư và các nhà thầu phụ khác của Bên A; </w:t>
+        <w:t xml:space="preserve">Bên B không tuân theo các hướng dẫn của Bên A, Tư vấn giám sát, Chủ đầu tư hoặc liên tiếp hành động một cách bất hợp tác đối với Bên A, Tư vấn giám sát, Chủ đầu tư và </w:t>
+      </w:r>
+      <w:del w:id="9177" w:author="VNCN E&amp;C" w:date="2026-10-06T08:00:00Z">
+        <w:r>
+          <w:rPr>
+            <w:rFonts w:ascii="Times New Roman" w:hAnsi="Times New Roman"/>
+            <w:sz w:val="26"/>
+            <w:szCs w:val="26"/>
+            <w:lang w:val="vi-VN"/>
+          </w:rPr>
+          <w:delText xml:space="preserve">các nhà thầu phụ khác của Bên A</w:delText>
+        </w:r>
+      </w:del>
+      <w:ins w:id="9178" w:author="VNCN E&amp;C" w:date="2026-10-06T08:00:00Z">
+        <w:r>
+          <w:rPr>
+            <w:rFonts w:ascii="Times New Roman" w:hAnsi="Times New Roman"/>
+            <w:sz w:val="26"/>
+            <w:szCs w:val="26"/>
+            <w:lang w:val="vi-VN"/>
+          </w:rPr>
+          <w:t xml:space="preserve">các đơn vị khác thi công trên Công trường</w:t>
+        </w:r>
+      </w:ins>
+      <w:r>
+        <w:rPr>
+          <w:rFonts w:ascii="Times New Roman" w:hAnsi="Times New Roman"/>
+          <w:sz w:val="26"/>
+          <w:szCs w:val="26"/>
+          <w:lang w:val="vi-VN"/>
+        </w:rPr>
+        <w:t xml:space="preserve">; </w:t>
       </w:r>
     </w:p>
     <w:p>
@@ -15806,7 +16416,38 @@
           <w:szCs w:val="26"/>
           <w:lang w:val="vi-VN"/>
         </w:rPr>
-        <w:t>Bên B chuyển nhượng cho nhà thầu khác toàn bộ công việc của Hợp đồng này;</w:t>
+        <w:t xml:space="preserve">Bên B chuyển nhượng cho </w:t>
+      </w:r>
+      <w:del w:id="9183" w:author="VNCN E&amp;C" w:date="2026-10-06T08:00:00Z">
+        <w:r>
+          <w:rPr>
+            <w:rFonts w:ascii="Times New Roman" w:hAnsi="Times New Roman"/>
+            <w:sz w:val="26"/>
+            <w:szCs w:val="26"/>
+            <w:lang w:val="vi-VN"/>
+          </w:rPr>
+          <w:delText xml:space="preserve">nhà thầu khác</w:delText>
+        </w:r>
+      </w:del>
+      <w:ins w:id="9184" w:author="VNCN E&amp;C" w:date="2026-10-06T08:00:00Z">
+        <w:r>
+          <w:rPr>
+            <w:rFonts w:ascii="Times New Roman" w:hAnsi="Times New Roman"/>
+            <w:sz w:val="26"/>
+            <w:szCs w:val="26"/>
+            <w:lang w:val="vi-VN"/>
+          </w:rPr>
+          <w:t xml:space="preserve">đơn vị khác</w:t>
+        </w:r>
+      </w:ins>
+      <w:r>
+        <w:rPr>
+          <w:rFonts w:ascii="Times New Roman" w:hAnsi="Times New Roman"/>
+          <w:sz w:val="26"/>
+          <w:szCs w:val="26"/>
+          <w:lang w:val="vi-VN"/>
+        </w:rPr>
+        <w:t xml:space="preserve"> toàn bộ công việc của Hợp đồng này;</w:t>
       </w:r>
     </w:p>
     <w:p>
@@ -16024,7 +16665,7 @@
         </w:rPr>
         <w:t xml:space="preserve">(ii) Bên A chậm thanh toán  cho Bên B quá 60 ngày so với thời gian quy định </w:t>
       </w:r>
-      <w:del w:id="9098" w:author="VNCN E&amp;C" w:date="2026-10-06T08:00:00Z">
+      <w:del w:id="9107" w:author="VNCN E&amp;C" w:date="2026-10-06T08:00:00Z">
         <w:r>
           <w:rPr>
             <w:rFonts w:ascii="Times New Roman" w:hAnsi="Times New Roman"/>
@@ -16034,7 +16675,7 @@
           <w:delText xml:space="preserve">trong Hợp đồng;</w:delText>
         </w:r>
       </w:del>
-      <w:ins w:id="9099" w:author="VNCN E&amp;C" w:date="2026-10-06T08:00:00Z">
+      <w:ins w:id="9108" w:author="VNCN E&amp;C" w:date="2026-10-06T08:00:00Z">
         <w:r>
           <w:rPr>
             <w:rFonts w:ascii="Times New Roman" w:hAnsi="Times New Roman"/>
@@ -16378,7 +17019,35 @@
           <w:sz w:val="26"/>
           <w:szCs w:val="26"/>
         </w:rPr>
-        <w:t>% giá trị Hợp đồng. Việc phạt vi phạm không loại trừ nghĩa vụ bồi thường toàn bộ thiệt hại thực tế của Bên A, bao gồm cả các khoản Bên A bị Chủ đầu tư phạt, khấu trừ, yêu cầu bồi thường do lỗi của Bên B. Bên A có thể thu hồi tiền phạt hợp đồng bằng tiền thanh toán hợp đồng hoặc bảo lãnh thực hiện hợp đồng theo quy định của Hợp đồng và pháp luật.</w:t>
+        <w:t xml:space="preserve">% giá trị Hợp đồng. Việc phạt vi phạm không loại trừ nghĩa vụ bồi thường toàn bộ thiệt hại thực tế của Bên A, bao gồm cả </w:t>
+      </w:r>
+      <w:del w:id="9179" w:author="VNCN E&amp;C" w:date="2026-10-06T08:00:00Z">
+        <w:r>
+          <w:rPr>
+            <w:rFonts w:ascii="Times New Roman" w:hAnsi="Times New Roman"/>
+            <w:sz w:val="26"/>
+            <w:szCs w:val="26"/>
+          </w:rPr>
+          <w:delText xml:space="preserve">các khoản Bên A bị Chủ đầu tư phạt, khấu trừ, yêu cầu bồi thường do lỗi của Bên B</w:delText>
+        </w:r>
+      </w:del>
+      <w:ins w:id="9180" w:author="VNCN E&amp;C" w:date="2026-10-06T08:00:00Z">
+        <w:r>
+          <w:rPr>
+            <w:rFonts w:ascii="Times New Roman" w:hAnsi="Times New Roman"/>
+            <w:sz w:val="26"/>
+            <w:szCs w:val="26"/>
+          </w:rPr>
+          <w:t xml:space="preserve">các khoản Bên A phải chịu phạt, bị khấu trừ hoặc phải bồi thường cho bên thứ ba do lỗi của Bên B</w:t>
+        </w:r>
+      </w:ins>
+      <w:r>
+        <w:rPr>
+          <w:rFonts w:ascii="Times New Roman" w:hAnsi="Times New Roman"/>
+          <w:sz w:val="26"/>
+          <w:szCs w:val="26"/>
+        </w:rPr>
+        <w:t xml:space="preserve">. Bên A có thể thu hồi tiền phạt hợp đồng bằng tiền thanh toán hợp đồng hoặc bảo lãnh thực hiện hợp đồng theo quy định của Hợp đồng và pháp luật.</w:t>
       </w:r>
     </w:p>
     <w:p>
@@ -16424,7 +17093,7 @@
         </w:rPr>
         <w:t xml:space="preserve">Nếu chất lượng của Hạng mục công trình này có một phần hay toàn bộ không đảm bảo đúng Hồ sơ thiết kế, Chỉ dẫn kỹ thuật, quy chuẩn kỹ thuật, tiêu chuẩn có liên quan thì Bên B phải chịu phạt </w:t>
       </w:r>
-      <w:del w:id="9100" w:author="VNCN E&amp;C" w:date="2026-10-06T08:00:00Z">
+      <w:del w:id="9109" w:author="VNCN E&amp;C" w:date="2026-10-06T08:00:00Z">
         <w:r>
           <w:rPr>
             <w:rFonts w:ascii="Times New Roman" w:hAnsi="Times New Roman"/>
@@ -16443,7 +17112,7 @@
           <w:delText xml:space="preserve">%</w:delText>
         </w:r>
       </w:del>
-      <w:ins w:id="9101" w:author="VNCN E&amp;C" w:date="2026-10-06T08:00:00Z">
+      <w:ins w:id="9110" w:author="VNCN E&amp;C" w:date="2026-10-06T08:00:00Z">
         <w:r>
           <w:rPr>
             <w:rFonts w:ascii="Times New Roman" w:hAnsi="Times New Roman"/>
@@ -16588,7 +17257,7 @@
         </w:rPr>
         <w:t xml:space="preserve">Nếu Bên B chậm tiến độ (không do lỗi của Chủ đầu tư hoặc Bên A, nhân lực của Chủ đầu tư, bên thứ ba không thuộc trách nhiệm của Bên B hoặc không thuộc các trường hợp bất khả kháng): </w:t>
       </w:r>
-      <w:del w:id="9102" w:author="VNCN E&amp;C" w:date="2026-10-06T08:00:00Z">
+      <w:del w:id="9111" w:author="VNCN E&amp;C" w:date="2026-10-06T08:00:00Z">
         <w:r>
           <w:rPr>
             <w:rFonts w:ascii="Times New Roman" w:hAnsi="Times New Roman"/>
@@ -16615,14 +17284,14 @@
           <w:delText xml:space="preserve"> giá trị hợp đồng cho mỗi ngày chậm so với từng mốc tiến độ quy định tại Điều 7.1 và Tiến độ chi tiết được Bên A chấp thuận</w:delText>
         </w:r>
       </w:del>
-      <w:ins w:id="9103" w:author="VNCN E&amp;C" w:date="2026-10-06T08:00:00Z">
+      <w:ins w:id="9112" w:author="VNCN E&amp;C" w:date="2026-10-06T08:00:00Z">
         <w:r>
           <w:rPr>
             <w:rFonts w:ascii="Times New Roman" w:hAnsi="Times New Roman"/>
             <w:sz w:val="26"/>
             <w:szCs w:val="26"/>
           </w:rPr>
-          <w:t xml:space="preserve">mức phạt cho mỗi ngày chậm so với từng mốc tiến độ quy định tại Điều 7.1 và Tiến độ chi tiết được Bên A chấp thuận áp dụng tương ứng (cùng tỷ lệ) với mức phạt chậm tiến độ của Hợp đồng thầu chính, là </w:t>
+          <w:t xml:space="preserve">mức phạt là </w:t>
         </w:r>
         <w:r>
           <w:rPr>
@@ -16639,7 +17308,7 @@
             <w:sz w:val="26"/>
             <w:szCs w:val="26"/>
           </w:rPr>
-          <w:t xml:space="preserve">% giá trị Hợp đồng/ngày</w:t>
+          <w:t xml:space="preserve">% giá trị Hợp đồng cho mỗi ngày chậm so với từng mốc tiến độ quy định tại Điều 7.1 và Tiến độ chi tiết được Bên A chấp thuận</w:t>
         </w:r>
       </w:ins>
       <w:r>
@@ -16715,7 +17384,7 @@
         </w:rPr>
         <w:t xml:space="preserve"> giá trị sai sót </w:t>
       </w:r>
-      <w:del w:id="9104" w:author="VNCN E&amp;C" w:date="2026-10-06T08:00:00Z">
+      <w:del w:id="9113" w:author="VNCN E&amp;C" w:date="2026-10-06T08:00:00Z">
         <w:r>
           <w:rPr>
             <w:rFonts w:ascii="Times New Roman" w:hAnsi="Times New Roman"/>
@@ -16742,7 +17411,7 @@
           <w:delText xml:space="preserve">%</w:delText>
         </w:r>
       </w:del>
-      <w:ins w:id="9105" w:author="VNCN E&amp;C" w:date="2026-10-06T08:00:00Z">
+      <w:ins w:id="9114" w:author="VNCN E&amp;C" w:date="2026-10-06T08:00:00Z">
         <w:r>
           <w:rPr>
             <w:rFonts w:ascii="Times New Roman" w:hAnsi="Times New Roman"/>
@@ -17155,7 +17824,7 @@
         </w:rPr>
         <w:t xml:space="preserve">(iii) </w:t>
       </w:r>
-      <w:del w:id="9106" w:author="VNCN E&amp;C" w:date="2026-10-06T08:00:00Z">
+      <w:del w:id="9115" w:author="VNCN E&amp;C" w:date="2026-10-06T08:00:00Z">
         <w:r>
           <w:rPr>
             <w:rFonts w:ascii="Times New Roman" w:hAnsi="Times New Roman"/>
@@ -17166,7 +17835,7 @@
           <w:delText xml:space="preserve">Thời hạn hoàn thành việc ký quyết toán Hợp đồng: Trong vòng 28 ngày kể từ ngày Bên A đã nhận được đầy đủ hồ sơ quyết toán Hợp đồng hợp lệ do Bên B lập theo quy định của Hợp đồng.</w:delText>
         </w:r>
       </w:del>
-      <w:ins w:id="9107" w:author="VNCN E&amp;C" w:date="2026-10-06T08:00:00Z">
+      <w:ins w:id="9116" w:author="VNCN E&amp;C" w:date="2026-10-06T08:00:00Z">
         <w:r>
           <w:rPr>
             <w:rFonts w:ascii="Times New Roman" w:hAnsi="Times New Roman"/>
@@ -17174,7 +17843,26 @@
             <w:sz w:val="26"/>
             <w:szCs w:val="26"/>
           </w:rPr>
-          <w:t xml:space="preserve">Trình tự, thời hạn xem xét và ký quyết toán Hợp đồng: áp dụng tương ứng (back-to-back) với Hợp đồng thầu chính đối với phần việc tương ứng.</w:t>
+          <w:t xml:space="preserve">Thời hạn hoàn thành việc ký quyết toán Hợp đồng: Trong vòng </w:t>
+        </w:r>
+        <w:r>
+          <w:rPr>
+            <w:rFonts w:ascii="Times New Roman" w:hAnsi="Times New Roman"/>
+            <w:bCs/>
+            <w:sz w:val="26"/>
+            <w:szCs w:val="26"/>
+            <w:highlight w:val="yellow"/>
+          </w:rPr>
+          <w:t xml:space="preserve">……</w:t>
+        </w:r>
+        <w:r>
+          <w:rPr>
+            <w:rFonts w:ascii="Times New Roman" w:hAnsi="Times New Roman"/>
+            <w:bCs/>
+            <w:sz w:val="26"/>
+            <w:szCs w:val="26"/>
+          </w:rPr>
+          <w:t xml:space="preserve"> ngày kể từ ngày Bên A đã nhận được đầy đủ hồ sơ quyết toán Hợp đồng hợp lệ do Bên B lập theo quy định của Hợp đồng.</w:t>
         </w:r>
       </w:ins>
     </w:p>
@@ -17426,7 +18114,7 @@
           <w:szCs w:val="26"/>
         </w:rPr>
       </w:pPr>
-      <w:del w:id="9108" w:author="VNCN E&amp;C" w:date="2026-10-06T08:00:00Z">
+      <w:del w:id="9117" w:author="VNCN E&amp;C" w:date="2026-10-06T08:00:00Z">
         <w:r>
           <w:rPr>
             <w:rFonts w:ascii="Times New Roman" w:hAnsi="Times New Roman"/>
@@ -17436,7 +18124,7 @@
           <w:delText>Thời hạn hiệu lực của bảo lãnh: Bảo lãnh tiền tạm ứng có hiệu lực đến 28 ngày sau ngày Bên A thu hồi hết tiền tạm ứng. Nếu các điều khoản của bảo lãnh có ghi rõ ngày hết hạn và Bên A vẫn chưa thu hồi hết tiền tạm ứng vào thời điểm 28 ngày trước khi hết hạn Bảo lãnh, thì Bên B phải gia hạn bảo lãnh tạm ứng với giá trị tiền tạm ứng còn lại Bên A chưa thu hồi, thời hạn cho đến hết 28 ngày sau ngày Bên A thu hồi hết tiền tạm ứng. Trường hợp Bên B không gia hạn theo các quy định này thì Bên B vi phạm hợp đồng.</w:delText>
         </w:r>
       </w:del>
-      <w:ins w:id="9109" w:author="VNCN E&amp;C" w:date="2026-10-06T08:00:00Z">
+      <w:ins w:id="9118" w:author="VNCN E&amp;C" w:date="2026-10-06T08:00:00Z">
         <w:r>
           <w:rPr>
             <w:rFonts w:ascii="Times New Roman" w:hAnsi="Times New Roman"/>
@@ -17558,7 +18246,7 @@
         </w:rPr>
         <w:t xml:space="preserve">Giá trị bảo lãnh thực hiện Hợp đồng: Bằng </w:t>
       </w:r>
-      <w:del w:id="9110" w:author="VNCN E&amp;C" w:date="2026-10-06T08:00:00Z">
+      <w:del w:id="9119" w:author="VNCN E&amp;C" w:date="2026-10-06T08:00:00Z">
         <w:r>
           <w:rPr>
             <w:rFonts w:ascii="Times New Roman" w:hAnsi="Times New Roman"/>
@@ -17577,7 +18265,7 @@
           <w:delText xml:space="preserve"> giá trị Hợp đồng.</w:delText>
         </w:r>
       </w:del>
-      <w:ins w:id="9111" w:author="VNCN E&amp;C" w:date="2026-10-06T08:00:00Z">
+      <w:ins w:id="9120" w:author="VNCN E&amp;C" w:date="2026-10-06T08:00:00Z">
         <w:r>
           <w:rPr>
             <w:rFonts w:ascii="Times New Roman" w:hAnsi="Times New Roman"/>
@@ -17621,8 +18309,50 @@
           <w:sz w:val="26"/>
           <w:szCs w:val="26"/>
         </w:rPr>
-        <w:t xml:space="preserve">Thời hạn hiệu lực của bảo lãnh: Bảo lãnh thực hiện Hợp đồng có hiệu lực kể từ ngày phát hành đến hết 28 ngày sau ngày Bên B hoàn thành, được Bên A chấp thuận nghiệm thu bàn giao Hạng mục công trình theo Hợp đồng và đã hoàn tất việc khắc phục các tồn tại, khiếm khuyết (nếu có), nhưng trong mọi trường hợp không sớm hơn thời điểm Bên A được Chủ đầu tư nghiệm thu phần công việc tương ứng do Bên B thực hiện. Nếu các điều khoản của bảo lãnh có ghi rõ ngày hết hạn và tại thời điểm 28 ngày trước khi hết </w:t>
+        <w:t xml:space="preserve">Thời hạn hiệu lực của bảo lãnh: Bảo lãnh thực hiện Hợp đồng có hiệu lực kể từ ngày phát hành đến hết 28 ngày sau ngày Bên B hoàn thành, được Bên A chấp thuận nghiệm thu bàn giao Hạng mục công trình theo Hợp đồng và đã hoàn tất việc khắc phục các tồn tại, khiếm khuyết (nếu có), nhưng trong mọi trường hợp không sớm hơn </w:t>
+      </w:r>
+      <w:del w:id="9181" w:author="VNCN E&amp;C" w:date="2026-10-06T08:00:00Z">
+        <w:r>
+          <w:rPr>
+            <w:rFonts w:ascii="Times New Roman" w:hAnsi="Times New Roman"/>
+            <w:sz w:val="26"/>
+            <w:szCs w:val="26"/>
+          </w:rPr>
+          <w:delText xml:space="preserve">thời điểm Bên A được Chủ đầu tư nghiệm thu</w:delText>
+        </w:r>
+      </w:del>
+      <w:ins w:id="9182" w:author="VNCN E&amp;C" w:date="2026-10-06T08:00:00Z">
+        <w:r>
+          <w:rPr>
+            <w:rFonts w:ascii="Times New Roman" w:hAnsi="Times New Roman"/>
+            <w:sz w:val="26"/>
+            <w:szCs w:val="26"/>
+          </w:rPr>
+          <w:t xml:space="preserve">thời điểm Chủ đầu tư nghiệm thu</w:t>
+        </w:r>
+      </w:ins>
+      <w:r>
+        <w:rPr>
+          <w:rFonts w:ascii="Times New Roman" w:hAnsi="Times New Roman"/>
+          <w:sz w:val="26"/>
+          <w:szCs w:val="26"/>
+        </w:rPr>
+        <w:t xml:space="preserve"> phần công việc tương ứng do Bên B thực hiện. Nếu các điều khoản của bảo lãnh có ghi rõ ngày hết hạn và tại thời điểm 28 ngày trước khi hết </w:t>
+      </w:r>
+      <w:r>
+        <w:rPr>
+          <w:rFonts w:ascii="Times New Roman" w:hAnsi="Times New Roman"/>
+          <w:sz w:val="26"/>
+          <w:szCs w:val="26"/>
+        </w:rPr>
         <w:lastRenderedPageBreak/>
+      </w:r>
+      <w:r>
+        <w:rPr>
+          <w:rFonts w:ascii="Times New Roman" w:hAnsi="Times New Roman"/>
+          <w:sz w:val="26"/>
+          <w:szCs w:val="26"/>
+        </w:rPr>
         <w:t>hạn mà các điều kiện nêu trên chưa được đáp ứng thì Bên B phải gia hạn bảo lãnh theo yêu cầu hợp lý của Bên A. Trường hợp Bên B không gia hạn theo các quy định này thì Bên B vi phạm Hợp đồng.</w:t>
       </w:r>
     </w:p>
@@ -17735,7 +18465,7 @@
         </w:rPr>
         <w:t xml:space="preserve">Áp dụng theo mẫu mà Bên A ban hành tại Biểu 06 đính kèm Hợp đồng này. Bảo lãnh bảo hành là bảo lãnh vô điều kiện và không hủy ngang dưới mọi hình thức, có giá trị tương đương khoản tiền giữ lại bảo hành được hoàn trả cho Bên B và có hiệu lực đến hết thời hạn bảo hành theo Hợp đồng </w:t>
       </w:r>
-      <w:del w:id="9112" w:author="VNCN E&amp;C" w:date="2026-10-06T08:00:00Z">
+      <w:del w:id="9121" w:author="VNCN E&amp;C" w:date="2026-10-06T08:00:00Z">
         <w:r>
           <w:rPr>
             <w:rFonts w:ascii="Times New Roman" w:hAnsi="Times New Roman"/>
@@ -17745,14 +18475,14 @@
           <w:delText xml:space="preserve">cộng thêm 14 ngày.</w:delText>
         </w:r>
       </w:del>
-      <w:ins w:id="9113" w:author="VNCN E&amp;C" w:date="2026-10-06T08:00:00Z">
+      <w:ins w:id="9122" w:author="VNCN E&amp;C" w:date="2026-10-06T08:00:00Z">
         <w:r>
           <w:rPr>
             <w:rFonts w:ascii="Times New Roman" w:hAnsi="Times New Roman"/>
             <w:sz w:val="26"/>
             <w:szCs w:val="26"/>
           </w:rPr>
-          <w:t xml:space="preserve">cộng thêm 14 ngày; hình thức, thời hạn và điều kiện giải tỏa bảo lãnh áp dụng tương ứng với Hợp đồng thầu chính nhưng không ngắn hơn thời hạn nêu trên.</w:t>
+          <w:t xml:space="preserve">cộng thêm 14 ngày; mọi khoản chi phí sửa chữa, khắc phục bảo hành mà Bên B không thực hiện được Bên A thu từ bảo lãnh này.</w:t>
         </w:r>
       </w:ins>
     </w:p>
@@ -17761,13 +18491,13 @@
         <w:spacing w:after="120" w:line="276" w:lineRule="auto"/>
         <w:jc w:val="both"/>
         <w:rPr>
-          <w:ins w:id="9114" w:author="VNCN E&amp;C" w:date="2026-10-06T08:00:00Z"/>
-          <w:rFonts w:ascii="Times New Roman" w:hAnsi="Times New Roman"/>
-          <w:sz w:val="26"/>
-          <w:szCs w:val="26"/>
-        </w:rPr>
-      </w:pPr>
-      <w:ins w:id="9115" w:author="VNCN E&amp;C" w:date="2026-10-06T08:00:00Z">
+          <w:ins w:id="9123" w:author="VNCN E&amp;C" w:date="2026-10-06T08:00:00Z"/>
+          <w:rFonts w:ascii="Times New Roman" w:hAnsi="Times New Roman"/>
+          <w:sz w:val="26"/>
+          <w:szCs w:val="26"/>
+        </w:rPr>
+      </w:pPr>
+      <w:ins w:id="9124" w:author="VNCN E&amp;C" w:date="2026-10-06T08:00:00Z">
         <w:r>
           <w:rPr>
             <w:rFonts w:ascii="Times New Roman" w:hAnsi="Times New Roman"/>
@@ -17994,7 +18724,7 @@
         </w:rPr>
         <w:t xml:space="preserve"> Hợp đồng này có hiệu lực kể từ ngày ký.</w:t>
       </w:r>
-      <w:ins w:id="9116" w:author="VNCN E&amp;C" w:date="2026-10-06T08:00:00Z">
+      <w:ins w:id="9125" w:author="VNCN E&amp;C" w:date="2026-10-06T08:00:00Z">
         <w:r>
           <w:rPr>
             <w:rFonts w:ascii="Times New Roman" w:hAnsi="Times New Roman"/>
@@ -18569,7 +19299,7 @@
               </w:rPr>
               <w:t xml:space="preserve"> Chi tiết </w:t>
             </w:r>
-            <w:del w:id="9117" w:author="VNCN E&amp;C" w:date="2026-10-06T08:00:00Z">
+            <w:del w:id="9126" w:author="VNCN E&amp;C" w:date="2026-10-06T08:00:00Z">
               <w:r>
                 <w:rPr>
                   <w:rFonts w:ascii="Times New Roman" w:hAnsi="Times New Roman"/>
@@ -18579,7 +19309,7 @@
                 <w:delText xml:space="preserve">giá hợp đồng</w:delText>
               </w:r>
             </w:del>
-            <w:ins w:id="9118" w:author="VNCN E&amp;C" w:date="2026-10-06T08:00:00Z">
+            <w:ins w:id="9127" w:author="VNCN E&amp;C" w:date="2026-10-06T08:00:00Z">
               <w:r>
                 <w:rPr>
                   <w:rFonts w:ascii="Times New Roman" w:hAnsi="Times New Roman"/>
@@ -19850,7 +20580,7 @@
         </w:rPr>
         <w:t xml:space="preserve">(Kèm theo hợp đồng </w:t>
       </w:r>
-      <w:del w:id="9119" w:author="VNCN E&amp;C" w:date="2026-10-06T08:00:00Z">
+      <w:del w:id="9128" w:author="VNCN E&amp;C" w:date="2026-10-06T08:00:00Z">
         <w:r>
           <w:rPr>
             <w:rFonts w:ascii="Times New Roman" w:hAnsi="Times New Roman"/>
@@ -19864,7 +20594,7 @@
           <w:delText xml:space="preserve">số……..…/2026/HĐ/YS/BXD ngày……tháng……năm 2026</w:delText>
         </w:r>
       </w:del>
-      <w:ins w:id="9120" w:author="VNCN E&amp;C" w:date="2026-10-06T08:00:00Z">
+      <w:ins w:id="9129" w:author="VNCN E&amp;C" w:date="2026-10-06T08:00:00Z">
         <w:r>
           <w:rPr>
             <w:rFonts w:ascii="Times New Roman" w:hAnsi="Times New Roman"/>
@@ -19897,7 +20627,7 @@
             <w:szCs w:val="26"/>
             <w:lang w:val="nl-NL"/>
           </w:rPr>
-          <w:t xml:space="preserve">/2026/HĐXD/VNCNEC-PH ngày </w:t>
+          <w:t xml:space="preserve">/2026/HĐKT/VNCNEC-PH ngày </w:t>
         </w:r>
         <w:r>
           <w:rPr>
@@ -20048,7 +20778,7 @@
         </w:rPr>
         <w:t xml:space="preserve">ồng </w:t>
       </w:r>
-      <w:del w:id="9121" w:author="VNCN E&amp;C" w:date="2026-10-06T08:00:00Z">
+      <w:del w:id="9130" w:author="VNCN E&amp;C" w:date="2026-10-06T08:00:00Z">
         <w:r>
           <w:rPr>
             <w:rFonts w:ascii="Times New Roman" w:hAnsi="Times New Roman"/>
@@ -20105,7 +20835,7 @@
           <w:delText xml:space="preserve">m 2026</w:delText>
         </w:r>
       </w:del>
-      <w:ins w:id="9122" w:author="VNCN E&amp;C" w:date="2026-10-06T08:00:00Z">
+      <w:ins w:id="9131" w:author="VNCN E&amp;C" w:date="2026-10-06T08:00:00Z">
         <w:r>
           <w:rPr>
             <w:rFonts w:ascii="Times New Roman" w:hAnsi="Times New Roman"/>
@@ -20135,7 +20865,7 @@
             <w:sz w:val="26"/>
             <w:szCs w:val="26"/>
           </w:rPr>
-          <w:t xml:space="preserve">/2026/HĐXD/VNCNEC-PH ngày </w:t>
+          <w:t xml:space="preserve">/2026/HĐKT/VNCNEC-PH ngày </w:t>
         </w:r>
         <w:r>
           <w:rPr>
@@ -20318,7 +21048,7 @@
         </w:rPr>
         <w:t xml:space="preserve">(Kèm theo hợp đồng </w:t>
       </w:r>
-      <w:del w:id="9123" w:author="VNCN E&amp;C" w:date="2026-10-06T08:00:00Z">
+      <w:del w:id="9132" w:author="VNCN E&amp;C" w:date="2026-10-06T08:00:00Z">
         <w:r>
           <w:rPr>
             <w:rFonts w:ascii="Times New Roman" w:hAnsi="Times New Roman"/>
@@ -20332,7 +21062,7 @@
           <w:delText xml:space="preserve">số……..…/2026/HĐ/YS/BXD ngày……tháng……năm 2026</w:delText>
         </w:r>
       </w:del>
-      <w:ins w:id="9124" w:author="VNCN E&amp;C" w:date="2026-10-06T08:00:00Z">
+      <w:ins w:id="9133" w:author="VNCN E&amp;C" w:date="2026-10-06T08:00:00Z">
         <w:r>
           <w:rPr>
             <w:rFonts w:ascii="Times New Roman" w:hAnsi="Times New Roman"/>
@@ -20365,7 +21095,7 @@
             <w:szCs w:val="26"/>
             <w:lang w:val="nl-NL"/>
           </w:rPr>
-          <w:t xml:space="preserve">/2026/HĐXD/VNCNEC-PH ngày </w:t>
+          <w:t xml:space="preserve">/2026/HĐKT/VNCNEC-PH ngày </w:t>
         </w:r>
         <w:r>
           <w:rPr>
@@ -20851,7 +21581,7 @@
         </w:rPr>
         <w:t xml:space="preserve">(Kèm theo hợp đồng </w:t>
       </w:r>
-      <w:del w:id="9125" w:author="VNCN E&amp;C" w:date="2026-10-06T08:00:00Z">
+      <w:del w:id="9134" w:author="VNCN E&amp;C" w:date="2026-10-06T08:00:00Z">
         <w:r>
           <w:rPr>
             <w:rFonts w:ascii="Times New Roman" w:hAnsi="Times New Roman"/>
@@ -20865,7 +21595,7 @@
           <w:delText xml:space="preserve">số……..…/2026/HĐ/YS/BXD ngày……tháng……năm 2026</w:delText>
         </w:r>
       </w:del>
-      <w:ins w:id="9126" w:author="VNCN E&amp;C" w:date="2026-10-06T08:00:00Z">
+      <w:ins w:id="9135" w:author="VNCN E&amp;C" w:date="2026-10-06T08:00:00Z">
         <w:r>
           <w:rPr>
             <w:rFonts w:ascii="Times New Roman" w:hAnsi="Times New Roman"/>
@@ -20898,7 +21628,7 @@
             <w:szCs w:val="26"/>
             <w:lang w:val="nl-NL"/>
           </w:rPr>
-          <w:t xml:space="preserve">/2026/HĐXD/VNCNEC-PH ngày </w:t>
+          <w:t xml:space="preserve">/2026/HĐKT/VNCNEC-PH ngày </w:t>
         </w:r>
         <w:r>
           <w:rPr>
@@ -21386,7 +22116,7 @@
         </w:rPr>
         <w:t xml:space="preserve">(Kèm theo hợp đồng </w:t>
       </w:r>
-      <w:del w:id="9127" w:author="VNCN E&amp;C" w:date="2026-10-06T08:00:00Z">
+      <w:del w:id="9136" w:author="VNCN E&amp;C" w:date="2026-10-06T08:00:00Z">
         <w:r>
           <w:rPr>
             <w:rFonts w:ascii="Times New Roman" w:hAnsi="Times New Roman"/>
@@ -21400,7 +22130,7 @@
           <w:delText xml:space="preserve">số……..…/2026/HĐ/YS/BXD ngày……tháng……năm 2026</w:delText>
         </w:r>
       </w:del>
-      <w:ins w:id="9128" w:author="VNCN E&amp;C" w:date="2026-10-06T08:00:00Z">
+      <w:ins w:id="9137" w:author="VNCN E&amp;C" w:date="2026-10-06T08:00:00Z">
         <w:r>
           <w:rPr>
             <w:rFonts w:ascii="Times New Roman" w:hAnsi="Times New Roman"/>
@@ -21433,7 +22163,7 @@
             <w:szCs w:val="26"/>
             <w:lang w:val="nl-NL"/>
           </w:rPr>
-          <w:t xml:space="preserve">/2026/HĐXD/VNCNEC-PH ngày </w:t>
+          <w:t xml:space="preserve">/2026/HĐKT/VNCNEC-PH ngày </w:t>
         </w:r>
         <w:r>
           <w:rPr>
@@ -21618,7 +22348,7 @@
         </w:rPr>
         <w:t xml:space="preserve">(Kèm theo hợp đồng </w:t>
       </w:r>
-      <w:del w:id="9129" w:author="VNCN E&amp;C" w:date="2026-10-06T08:00:00Z">
+      <w:del w:id="9138" w:author="VNCN E&amp;C" w:date="2026-10-06T08:00:00Z">
         <w:r>
           <w:rPr>
             <w:rFonts w:ascii="Times New Roman" w:hAnsi="Times New Roman"/>
@@ -21632,7 +22362,7 @@
           <w:delText xml:space="preserve">số……..…/2026/HĐ/YS/BXD ngày……tháng……năm 2026</w:delText>
         </w:r>
       </w:del>
-      <w:ins w:id="9130" w:author="VNCN E&amp;C" w:date="2026-10-06T08:00:00Z">
+      <w:ins w:id="9139" w:author="VNCN E&amp;C" w:date="2026-10-06T08:00:00Z">
         <w:r>
           <w:rPr>
             <w:rFonts w:ascii="Times New Roman" w:hAnsi="Times New Roman"/>
@@ -21665,7 +22395,7 @@
             <w:szCs w:val="26"/>
             <w:lang w:val="nl-NL"/>
           </w:rPr>
-          <w:t xml:space="preserve">/2026/HĐXD/VNCNEC-PH ngày </w:t>
+          <w:t xml:space="preserve">/2026/HĐKT/VNCNEC-PH ngày </w:t>
         </w:r>
         <w:r>
           <w:rPr>
@@ -21867,7 +22597,7 @@
         </w:rPr>
         <w:t xml:space="preserve">(Kèm theo hợp đồng </w:t>
       </w:r>
-      <w:del w:id="9131" w:author="VNCN E&amp;C" w:date="2026-10-06T08:00:00Z">
+      <w:del w:id="9140" w:author="VNCN E&amp;C" w:date="2026-10-06T08:00:00Z">
         <w:r>
           <w:rPr>
             <w:rFonts w:ascii="Times New Roman" w:hAnsi="Times New Roman"/>
@@ -21881,7 +22611,7 @@
           <w:delText xml:space="preserve">số……..…/2026/HĐ/YS/BXD ngày……tháng……năm 2026</w:delText>
         </w:r>
       </w:del>
-      <w:ins w:id="9132" w:author="VNCN E&amp;C" w:date="2026-10-06T08:00:00Z">
+      <w:ins w:id="9141" w:author="VNCN E&amp;C" w:date="2026-10-06T08:00:00Z">
         <w:r>
           <w:rPr>
             <w:rFonts w:ascii="Times New Roman" w:hAnsi="Times New Roman"/>
@@ -21914,7 +22644,7 @@
             <w:szCs w:val="26"/>
             <w:lang w:val="nl-NL"/>
           </w:rPr>
-          <w:t xml:space="preserve">/2026/HĐXD/VNCNEC-PH ngày </w:t>
+          <w:t xml:space="preserve">/2026/HĐKT/VNCNEC-PH ngày </w:t>
         </w:r>
         <w:r>
           <w:rPr>

</xml_diff>